<commit_message>
Lc 15.11-32: segunda rodada do polimento (NAA oficial, ponto IV ampliado, aplicação à igreja, Sa'id) + DOCX do sermão final e púlpito atualizado
Co-Authored-By: Claude Opus 5.5 <noreply@anthropic.com>
Claude-Session: https://claude.ai/code/session_01XSxGhi4Q8iZVijzMQYveMu
</commit_message>
<xml_diff>
--- a/estudos/lucas/Duas-Formas-de-Fugir-do-Rei_Lc15-11-32_pulpito.docx
+++ b/estudos/lucas/Duas-Formas-de-Fugir-do-Rei_Lc15-11-32_pulpito.docx
@@ -774,7 +774,7 @@
           <w:sz w:val="24"/>
           <w:szCs w:val="24"/>
         </w:rPr>
-        <w:t xml:space="preserve">: fome; "colou-se" a um estrangeiro (</w:t>
+        <w:t xml:space="preserve">: fome; "foi pedir trabalho" (grego: "colou-se") a um estrangeiro (</w:t>
       </w:r>
       <w:r>
         <w:rPr>
@@ -1570,7 +1570,7 @@
           <w:sz w:val="24"/>
           <w:szCs w:val="24"/>
         </w:rPr>
-        <w:t xml:space="preserve">, "Depressa!": </w:t>
+        <w:t xml:space="preserve">, "Tragam depressa": </w:t>
       </w:r>
       <w:r>
         <w:rPr>
@@ -3659,7 +3659,7 @@
           <w:sz w:val="24"/>
           <w:szCs w:val="24"/>
         </w:rPr>
-        <w:t xml:space="preserve"> · "tudo o que é meu é seu" = </w:t>
+        <w:t xml:space="preserve"> · "tudo o que eu tenho é seu" = </w:t>
       </w:r>
       <w:r>
         <w:rPr>
@@ -3722,7 +3722,7 @@
           <w:sz w:val="24"/>
           <w:szCs w:val="24"/>
         </w:rPr>
-        <w:t xml:space="preserve">: "esse seu </w:t>
+        <w:t xml:space="preserve">: "este seu </w:t>
       </w:r>
       <w:r>
         <w:rPr>
@@ -4230,33 +4230,59 @@
           <w:sz w:val="24"/>
           <w:szCs w:val="24"/>
         </w:rPr>
-        <w:t xml:space="preserve">: "Pai, perdoa-lhes" (Lc 23.34) → </w:t>
-      </w:r>
-      <w:r>
-        <w:rPr>
-          <w:rFonts w:ascii="Cambria" w:cs="Cambria" w:eastAsia="Cambria" w:hAnsi="Cambria"/>
-          <w:b/>
-          <w:bCs/>
-          <w:i w:val="false"/>
-          <w:iCs w:val="false"/>
-          <w:color w:val="2B2B33"/>
-          <w:sz w:val="24"/>
-          <w:szCs w:val="24"/>
-        </w:rPr>
-        <w:t xml:space="preserve">"Deus meu"</w:t>
-      </w:r>
-      <w:r>
-        <w:rPr>
-          <w:rFonts w:ascii="Cambria" w:cs="Cambria" w:eastAsia="Cambria" w:hAnsi="Cambria"/>
-          <w:b w:val="false"/>
-          <w:bCs w:val="false"/>
-          <w:i w:val="false"/>
-          <w:iCs w:val="false"/>
-          <w:color w:val="2B2B33"/>
-          <w:sz w:val="24"/>
-          <w:szCs w:val="24"/>
-        </w:rPr>
-        <w:t xml:space="preserve"> (Mc 15.34; </w:t>
+        <w:t xml:space="preserve">: sempre "Pai"; Getsêmani, "</w:t>
+      </w:r>
+      <w:r>
+        <w:rPr>
+          <w:rFonts w:ascii="Cambria" w:cs="Cambria" w:eastAsia="Cambria" w:hAnsi="Cambria"/>
+          <w:b/>
+          <w:bCs/>
+          <w:i w:val="false"/>
+          <w:iCs w:val="false"/>
+          <w:color w:val="2B2B33"/>
+          <w:sz w:val="24"/>
+          <w:szCs w:val="24"/>
+        </w:rPr>
+        <w:t xml:space="preserve">Aba</w:t>
+      </w:r>
+      <w:r>
+        <w:rPr>
+          <w:rFonts w:ascii="Cambria" w:cs="Cambria" w:eastAsia="Cambria" w:hAnsi="Cambria"/>
+          <w:b w:val="false"/>
+          <w:bCs w:val="false"/>
+          <w:i w:val="false"/>
+          <w:iCs w:val="false"/>
+          <w:color w:val="2B2B33"/>
+          <w:sz w:val="24"/>
+          <w:szCs w:val="24"/>
+        </w:rPr>
+        <w:t xml:space="preserve">, Pai" (Mc 14.36); "Pai, perdoa-lhes" (Lc 23.34) → trevas (Mc 15.33) → </w:t>
+      </w:r>
+      <w:r>
+        <w:rPr>
+          <w:rFonts w:ascii="Cambria" w:cs="Cambria" w:eastAsia="Cambria" w:hAnsi="Cambria"/>
+          <w:b/>
+          <w:bCs/>
+          <w:i w:val="false"/>
+          <w:iCs w:val="false"/>
+          <w:color w:val="2B2B33"/>
+          <w:sz w:val="24"/>
+          <w:szCs w:val="24"/>
+        </w:rPr>
+        <w:t xml:space="preserve">"Meu Deus, meu Deus"</w:t>
+      </w:r>
+      <w:r>
+        <w:rPr>
+          <w:rFonts w:ascii="Cambria" w:cs="Cambria" w:eastAsia="Cambria" w:hAnsi="Cambria"/>
+          <w:b w:val="false"/>
+          <w:bCs w:val="false"/>
+          <w:i w:val="false"/>
+          <w:iCs w:val="false"/>
+          <w:color w:val="2B2B33"/>
+          <w:sz w:val="24"/>
+          <w:szCs w:val="24"/>
+        </w:rPr>
+        <w:t xml:space="preserve"> (Mc 15.34; Sl 22.1; </w:t>
       </w:r>
       <w:r>
         <w:rPr>
@@ -4269,6 +4295,32 @@
           <w:sz w:val="24"/>
           <w:szCs w:val="24"/>
         </w:rPr>
+        <w:t xml:space="preserve">a única oração sem "Pai"</w:t>
+      </w:r>
+      <w:r>
+        <w:rPr>
+          <w:rFonts w:ascii="Cambria" w:cs="Cambria" w:eastAsia="Cambria" w:hAnsi="Cambria"/>
+          <w:b w:val="false"/>
+          <w:bCs w:val="false"/>
+          <w:i w:val="false"/>
+          <w:iCs w:val="false"/>
+          <w:color w:val="2B2B33"/>
+          <w:sz w:val="24"/>
+          <w:szCs w:val="24"/>
+        </w:rPr>
+        <w:t xml:space="preserve">; </w:t>
+      </w:r>
+      <w:r>
+        <w:rPr>
+          <w:rFonts w:ascii="Cambria" w:cs="Cambria" w:eastAsia="Cambria" w:hAnsi="Cambria"/>
+          <w:b w:val="false"/>
+          <w:bCs w:val="false"/>
+          <w:i/>
+          <w:iCs/>
+          <w:color w:val="2B2B33"/>
+          <w:sz w:val="24"/>
+          <w:szCs w:val="24"/>
+        </w:rPr>
         <w:t xml:space="preserve">nunca deixou de ser Filho; foi tratado como quem não é</w:t>
       </w:r>
       <w:r>
@@ -4282,7 +4334,33 @@
           <w:sz w:val="24"/>
           <w:szCs w:val="24"/>
         </w:rPr>
-        <w:t xml:space="preserve">) → </w:t>
+        <w:t xml:space="preserve">) → o irmão ficou fora porque quis; </w:t>
+      </w:r>
+      <w:r>
+        <w:rPr>
+          <w:rFonts w:ascii="Cambria" w:cs="Cambria" w:eastAsia="Cambria" w:hAnsi="Cambria"/>
+          <w:b/>
+          <w:bCs/>
+          <w:i w:val="false"/>
+          <w:iCs w:val="false"/>
+          <w:color w:val="2B2B33"/>
+          <w:sz w:val="24"/>
+          <w:szCs w:val="24"/>
+        </w:rPr>
+        <w:t xml:space="preserve">Jesus foi posto "fora da porta"</w:t>
+      </w:r>
+      <w:r>
+        <w:rPr>
+          <w:rFonts w:ascii="Cambria" w:cs="Cambria" w:eastAsia="Cambria" w:hAnsi="Cambria"/>
+          <w:b w:val="false"/>
+          <w:bCs w:val="false"/>
+          <w:i w:val="false"/>
+          <w:iCs w:val="false"/>
+          <w:color w:val="2B2B33"/>
+          <w:sz w:val="24"/>
+          <w:szCs w:val="24"/>
+        </w:rPr>
+        <w:t xml:space="preserve"> (Hb 13.12) → </w:t>
       </w:r>
       <w:r>
         <w:rPr>
@@ -4308,7 +4386,7 @@
           <w:sz w:val="24"/>
           <w:szCs w:val="24"/>
         </w:rPr>
-        <w:t xml:space="preserve"> (Lc 23.46) → </w:t>
+        <w:t xml:space="preserve"> (Lc 23.46) → morto e reviveu → </w:t>
       </w:r>
       <w:r>
         <w:rPr>
@@ -4334,7 +4412,33 @@
           <w:sz w:val="24"/>
           <w:szCs w:val="24"/>
         </w:rPr>
-        <w:t xml:space="preserve"> (Gl 4.6)</w:t>
+        <w:t xml:space="preserve"> (Gl 4.6) → "</w:t>
+      </w:r>
+      <w:r>
+        <w:rPr>
+          <w:rFonts w:ascii="Cambria" w:cs="Cambria" w:eastAsia="Cambria" w:hAnsi="Cambria"/>
+          <w:b/>
+          <w:bCs/>
+          <w:i w:val="false"/>
+          <w:iCs w:val="false"/>
+          <w:color w:val="2B2B33"/>
+          <w:sz w:val="24"/>
+          <w:szCs w:val="24"/>
+        </w:rPr>
+        <w:t xml:space="preserve">já não é escravo, mas filho... herdeiro</w:t>
+      </w:r>
+      <w:r>
+        <w:rPr>
+          <w:rFonts w:ascii="Cambria" w:cs="Cambria" w:eastAsia="Cambria" w:hAnsi="Cambria"/>
+          <w:b w:val="false"/>
+          <w:bCs w:val="false"/>
+          <w:i w:val="false"/>
+          <w:iCs w:val="false"/>
+          <w:color w:val="2B2B33"/>
+          <w:sz w:val="24"/>
+          <w:szCs w:val="24"/>
+        </w:rPr>
+        <w:t xml:space="preserve">" (Gl 4.7) = resposta ao v. 29</w:t>
       </w:r>
     </w:p>
     <w:p>
@@ -4409,6 +4513,58 @@
           <w:szCs w:val="24"/>
         </w:rPr>
         <w:t xml:space="preserve">Cristo viveu uma vida que ninguém desejou ter, para que quem merece ter possa viver uma vida que não merece.</w:t>
+      </w:r>
+      <w:r>
+        <w:rPr>
+          <w:rFonts w:ascii="Cambria" w:cs="Cambria" w:eastAsia="Cambria" w:hAnsi="Cambria"/>
+          <w:b w:val="false"/>
+          <w:bCs w:val="false"/>
+          <w:i w:val="false"/>
+          <w:iCs w:val="false"/>
+          <w:color w:val="2B2B33"/>
+          <w:sz w:val="24"/>
+          <w:szCs w:val="24"/>
+        </w:rPr>
+        <w:t xml:space="preserve"> · "Menos fariseu" na força = </w:t>
+      </w:r>
+      <w:r>
+        <w:rPr>
+          <w:rFonts w:ascii="Cambria" w:cs="Cambria" w:eastAsia="Cambria" w:hAnsi="Cambria"/>
+          <w:b/>
+          <w:bCs/>
+          <w:i w:val="false"/>
+          <w:iCs w:val="false"/>
+          <w:color w:val="2B2B33"/>
+          <w:sz w:val="24"/>
+          <w:szCs w:val="24"/>
+        </w:rPr>
+        <w:t xml:space="preserve">fariseu mais cansado</w:t>
+      </w:r>
+      <w:r>
+        <w:rPr>
+          <w:rFonts w:ascii="Cambria" w:cs="Cambria" w:eastAsia="Cambria" w:hAnsi="Cambria"/>
+          <w:b w:val="false"/>
+          <w:bCs w:val="false"/>
+          <w:i w:val="false"/>
+          <w:iCs w:val="false"/>
+          <w:color w:val="2B2B33"/>
+          <w:sz w:val="24"/>
+          <w:szCs w:val="24"/>
+        </w:rPr>
+        <w:t xml:space="preserve">; </w:t>
+      </w:r>
+      <w:r>
+        <w:rPr>
+          <w:rFonts w:ascii="Cambria" w:cs="Cambria" w:eastAsia="Cambria" w:hAnsi="Cambria"/>
+          <w:b w:val="false"/>
+          <w:bCs w:val="false"/>
+          <w:i/>
+          <w:iCs/>
+          <w:color w:val="2B2B33"/>
+          <w:sz w:val="24"/>
+          <w:szCs w:val="24"/>
+        </w:rPr>
+        <w:t xml:space="preserve">o Mozart é o mesmo, muda a razão</w:t>
       </w:r>
     </w:p>
     <w:p>
@@ -4491,54 +4647,184 @@
       <w:r>
         <w:rPr>
           <w:rFonts w:ascii="Cambria" w:cs="Cambria" w:eastAsia="Cambria" w:hAnsi="Cambria"/>
-          <w:b w:val="false"/>
-          <w:bCs w:val="false"/>
-          <w:i w:val="false"/>
-          <w:iCs w:val="false"/>
-          <w:color w:val="2B2B33"/>
-          <w:sz w:val="24"/>
-          <w:szCs w:val="24"/>
-        </w:rPr>
-        <w:t xml:space="preserve">"Menos fariseu" na força = </w:t>
-      </w:r>
-      <w:r>
-        <w:rPr>
-          <w:rFonts w:ascii="Cambria" w:cs="Cambria" w:eastAsia="Cambria" w:hAnsi="Cambria"/>
-          <w:b/>
-          <w:bCs/>
-          <w:i w:val="false"/>
-          <w:iCs w:val="false"/>
-          <w:color w:val="2B2B33"/>
-          <w:sz w:val="24"/>
-          <w:szCs w:val="24"/>
-        </w:rPr>
-        <w:t xml:space="preserve">fariseu mais cansado</w:t>
-      </w:r>
-      <w:r>
-        <w:rPr>
-          <w:rFonts w:ascii="Cambria" w:cs="Cambria" w:eastAsia="Cambria" w:hAnsi="Cambria"/>
-          <w:b w:val="false"/>
-          <w:bCs w:val="false"/>
-          <w:i w:val="false"/>
-          <w:iCs w:val="false"/>
-          <w:color w:val="2B2B33"/>
-          <w:sz w:val="24"/>
-          <w:szCs w:val="24"/>
-        </w:rPr>
-        <w:t xml:space="preserve">. </w:t>
-      </w:r>
-      <w:r>
-        <w:rPr>
-          <w:rFonts w:ascii="Cambria" w:cs="Cambria" w:eastAsia="Cambria" w:hAnsi="Cambria"/>
-          <w:b w:val="false"/>
-          <w:bCs w:val="false"/>
-          <w:i/>
-          <w:iCs/>
-          <w:color w:val="2B2B33"/>
-          <w:sz w:val="24"/>
-          <w:szCs w:val="24"/>
-        </w:rPr>
-        <w:t xml:space="preserve">O Mozart é o mesmo; muda a razão</w:t>
+          <w:b/>
+          <w:bCs/>
+          <w:i w:val="false"/>
+          <w:iCs w:val="false"/>
+          <w:color w:val="2B2B33"/>
+          <w:sz w:val="24"/>
+          <w:szCs w:val="24"/>
+        </w:rPr>
+        <w:t xml:space="preserve">Picolé 3</w:t>
+      </w:r>
+      <w:r>
+        <w:rPr>
+          <w:rFonts w:ascii="Cambria" w:cs="Cambria" w:eastAsia="Cambria" w:hAnsi="Cambria"/>
+          <w:b w:val="false"/>
+          <w:bCs w:val="false"/>
+          <w:i w:val="false"/>
+          <w:iCs w:val="false"/>
+          <w:color w:val="2B2B33"/>
+          <w:sz w:val="24"/>
+          <w:szCs w:val="24"/>
+        </w:rPr>
+        <w:t xml:space="preserve">: meu pai precisava me </w:t>
+      </w:r>
+      <w:r>
+        <w:rPr>
+          <w:rFonts w:ascii="Cambria" w:cs="Cambria" w:eastAsia="Cambria" w:hAnsi="Cambria"/>
+          <w:b/>
+          <w:bCs/>
+          <w:i w:val="false"/>
+          <w:iCs w:val="false"/>
+          <w:color w:val="2B2B33"/>
+          <w:sz w:val="24"/>
+          <w:szCs w:val="24"/>
+        </w:rPr>
+        <w:t xml:space="preserve">obrigar</w:t>
+      </w:r>
+      <w:r>
+        <w:rPr>
+          <w:rFonts w:ascii="Cambria" w:cs="Cambria" w:eastAsia="Cambria" w:hAnsi="Cambria"/>
+          <w:b w:val="false"/>
+          <w:bCs w:val="false"/>
+          <w:i w:val="false"/>
+          <w:iCs w:val="false"/>
+          <w:color w:val="2B2B33"/>
+          <w:sz w:val="24"/>
+          <w:szCs w:val="24"/>
+        </w:rPr>
+        <w:t xml:space="preserve">; o Irmão </w:t>
+      </w:r>
+      <w:r>
+        <w:rPr>
+          <w:rFonts w:ascii="Cambria" w:cs="Cambria" w:eastAsia="Cambria" w:hAnsi="Cambria"/>
+          <w:b/>
+          <w:bCs/>
+          <w:i w:val="false"/>
+          <w:iCs w:val="false"/>
+          <w:color w:val="2B2B33"/>
+          <w:sz w:val="24"/>
+          <w:szCs w:val="24"/>
+        </w:rPr>
+        <w:t xml:space="preserve">não foi obrigado</w:t>
+      </w:r>
+      <w:r>
+        <w:rPr>
+          <w:rFonts w:ascii="Cambria" w:cs="Cambria" w:eastAsia="Cambria" w:hAnsi="Cambria"/>
+          <w:b w:val="false"/>
+          <w:bCs w:val="false"/>
+          <w:i w:val="false"/>
+          <w:iCs w:val="false"/>
+          <w:color w:val="2B2B33"/>
+          <w:sz w:val="24"/>
+          <w:szCs w:val="24"/>
+        </w:rPr>
+        <w:t xml:space="preserve"> (</w:t>
+      </w:r>
+      <w:r>
+        <w:rPr>
+          <w:rFonts w:ascii="Cambria" w:cs="Cambria" w:eastAsia="Cambria" w:hAnsi="Cambria"/>
+          <w:b/>
+          <w:bCs/>
+          <w:i w:val="false"/>
+          <w:iCs w:val="false"/>
+          <w:color w:val="2B2B33"/>
+          <w:sz w:val="24"/>
+          <w:szCs w:val="24"/>
+        </w:rPr>
+        <w:t xml:space="preserve">Jo 10.18</w:t>
+      </w:r>
+      <w:r>
+        <w:rPr>
+          <w:rFonts w:ascii="Cambria" w:cs="Cambria" w:eastAsia="Cambria" w:hAnsi="Cambria"/>
+          <w:b w:val="false"/>
+          <w:bCs w:val="false"/>
+          <w:i w:val="false"/>
+          <w:iCs w:val="false"/>
+          <w:color w:val="2B2B33"/>
+          <w:sz w:val="24"/>
+          <w:szCs w:val="24"/>
+        </w:rPr>
+        <w:t xml:space="preserve">); </w:t>
+      </w:r>
+      <w:r>
+        <w:rPr>
+          <w:rFonts w:ascii="Cambria" w:cs="Cambria" w:eastAsia="Cambria" w:hAnsi="Cambria"/>
+          <w:b/>
+          <w:bCs/>
+          <w:i w:val="false"/>
+          <w:iCs w:val="false"/>
+          <w:color w:val="2B2B33"/>
+          <w:sz w:val="24"/>
+          <w:szCs w:val="24"/>
+        </w:rPr>
+        <w:t xml:space="preserve">deu tudo</w:t>
+      </w:r>
+      <w:r>
+        <w:rPr>
+          <w:rFonts w:ascii="Cambria" w:cs="Cambria" w:eastAsia="Cambria" w:hAnsi="Cambria"/>
+          <w:b w:val="false"/>
+          <w:bCs w:val="false"/>
+          <w:i w:val="false"/>
+          <w:iCs w:val="false"/>
+          <w:color w:val="2B2B33"/>
+          <w:sz w:val="24"/>
+          <w:szCs w:val="24"/>
+        </w:rPr>
+        <w:t xml:space="preserve"> (</w:t>
+      </w:r>
+      <w:r>
+        <w:rPr>
+          <w:rFonts w:ascii="Cambria" w:cs="Cambria" w:eastAsia="Cambria" w:hAnsi="Cambria"/>
+          <w:b/>
+          <w:bCs/>
+          <w:i w:val="false"/>
+          <w:iCs w:val="false"/>
+          <w:color w:val="2B2B33"/>
+          <w:sz w:val="24"/>
+          <w:szCs w:val="24"/>
+        </w:rPr>
+        <w:t xml:space="preserve">2Co 8.9</w:t>
+      </w:r>
+      <w:r>
+        <w:rPr>
+          <w:rFonts w:ascii="Cambria" w:cs="Cambria" w:eastAsia="Cambria" w:hAnsi="Cambria"/>
+          <w:b w:val="false"/>
+          <w:bCs w:val="false"/>
+          <w:i w:val="false"/>
+          <w:iCs w:val="false"/>
+          <w:color w:val="2B2B33"/>
+          <w:sz w:val="24"/>
+          <w:szCs w:val="24"/>
+        </w:rPr>
+        <w:t xml:space="preserve">; </w:t>
+      </w:r>
+      <w:r>
+        <w:rPr>
+          <w:rFonts w:ascii="Cambria" w:cs="Cambria" w:eastAsia="Cambria" w:hAnsi="Cambria"/>
+          <w:b/>
+          <w:bCs/>
+          <w:i w:val="false"/>
+          <w:iCs w:val="false"/>
+          <w:color w:val="2B2B33"/>
+          <w:sz w:val="24"/>
+          <w:szCs w:val="24"/>
+        </w:rPr>
+        <w:t xml:space="preserve">Rm 8.17</w:t>
+      </w:r>
+      <w:r>
+        <w:rPr>
+          <w:rFonts w:ascii="Cambria" w:cs="Cambria" w:eastAsia="Cambria" w:hAnsi="Cambria"/>
+          <w:b w:val="false"/>
+          <w:bCs w:val="false"/>
+          <w:i w:val="false"/>
+          <w:iCs w:val="false"/>
+          <w:color w:val="2B2B33"/>
+          <w:sz w:val="24"/>
+          <w:szCs w:val="24"/>
+        </w:rPr>
+        <w:t xml:space="preserve">)</w:t>
       </w:r>
     </w:p>
     <w:p>
@@ -4562,176 +4848,68 @@
           <w:sz w:val="24"/>
           <w:szCs w:val="24"/>
         </w:rPr>
-        <w:t xml:space="preserve">Picolé 3</w:t>
-      </w:r>
-      <w:r>
-        <w:rPr>
-          <w:rFonts w:ascii="Cambria" w:cs="Cambria" w:eastAsia="Cambria" w:hAnsi="Cambria"/>
-          <w:b w:val="false"/>
-          <w:bCs w:val="false"/>
-          <w:i w:val="false"/>
-          <w:iCs w:val="false"/>
-          <w:color w:val="2B2B33"/>
-          <w:sz w:val="24"/>
-          <w:szCs w:val="24"/>
-        </w:rPr>
-        <w:t xml:space="preserve">: meu pai precisava me </w:t>
-      </w:r>
-      <w:r>
-        <w:rPr>
-          <w:rFonts w:ascii="Cambria" w:cs="Cambria" w:eastAsia="Cambria" w:hAnsi="Cambria"/>
-          <w:b/>
-          <w:bCs/>
-          <w:i w:val="false"/>
-          <w:iCs w:val="false"/>
-          <w:color w:val="2B2B33"/>
-          <w:sz w:val="24"/>
-          <w:szCs w:val="24"/>
-        </w:rPr>
-        <w:t xml:space="preserve">obrigar</w:t>
-      </w:r>
-      <w:r>
-        <w:rPr>
-          <w:rFonts w:ascii="Cambria" w:cs="Cambria" w:eastAsia="Cambria" w:hAnsi="Cambria"/>
-          <w:b w:val="false"/>
-          <w:bCs w:val="false"/>
-          <w:i w:val="false"/>
-          <w:iCs w:val="false"/>
-          <w:color w:val="2B2B33"/>
-          <w:sz w:val="24"/>
-          <w:szCs w:val="24"/>
-        </w:rPr>
-        <w:t xml:space="preserve">; o Irmão </w:t>
-      </w:r>
-      <w:r>
-        <w:rPr>
-          <w:rFonts w:ascii="Cambria" w:cs="Cambria" w:eastAsia="Cambria" w:hAnsi="Cambria"/>
-          <w:b/>
-          <w:bCs/>
-          <w:i w:val="false"/>
-          <w:iCs w:val="false"/>
-          <w:color w:val="2B2B33"/>
-          <w:sz w:val="24"/>
-          <w:szCs w:val="24"/>
-        </w:rPr>
-        <w:t xml:space="preserve">não foi obrigado</w:t>
-      </w:r>
-      <w:r>
-        <w:rPr>
-          <w:rFonts w:ascii="Cambria" w:cs="Cambria" w:eastAsia="Cambria" w:hAnsi="Cambria"/>
-          <w:b w:val="false"/>
-          <w:bCs w:val="false"/>
-          <w:i w:val="false"/>
-          <w:iCs w:val="false"/>
-          <w:color w:val="2B2B33"/>
-          <w:sz w:val="24"/>
-          <w:szCs w:val="24"/>
-        </w:rPr>
-        <w:t xml:space="preserve"> (</w:t>
-      </w:r>
-      <w:r>
-        <w:rPr>
-          <w:rFonts w:ascii="Cambria" w:cs="Cambria" w:eastAsia="Cambria" w:hAnsi="Cambria"/>
-          <w:b/>
-          <w:bCs/>
-          <w:i w:val="false"/>
-          <w:iCs w:val="false"/>
-          <w:color w:val="2B2B33"/>
-          <w:sz w:val="24"/>
-          <w:szCs w:val="24"/>
-        </w:rPr>
-        <w:t xml:space="preserve">Jo 10.18</w:t>
-      </w:r>
-      <w:r>
-        <w:rPr>
-          <w:rFonts w:ascii="Cambria" w:cs="Cambria" w:eastAsia="Cambria" w:hAnsi="Cambria"/>
-          <w:b w:val="false"/>
-          <w:bCs w:val="false"/>
-          <w:i w:val="false"/>
-          <w:iCs w:val="false"/>
-          <w:color w:val="2B2B33"/>
-          <w:sz w:val="24"/>
-          <w:szCs w:val="24"/>
-        </w:rPr>
-        <w:t xml:space="preserve">); </w:t>
-      </w:r>
-      <w:r>
-        <w:rPr>
-          <w:rFonts w:ascii="Cambria" w:cs="Cambria" w:eastAsia="Cambria" w:hAnsi="Cambria"/>
-          <w:b/>
-          <w:bCs/>
-          <w:i w:val="false"/>
-          <w:iCs w:val="false"/>
-          <w:color w:val="2B2B33"/>
-          <w:sz w:val="24"/>
-          <w:szCs w:val="24"/>
-        </w:rPr>
-        <w:t xml:space="preserve">deu tudo</w:t>
-      </w:r>
-      <w:r>
-        <w:rPr>
-          <w:rFonts w:ascii="Cambria" w:cs="Cambria" w:eastAsia="Cambria" w:hAnsi="Cambria"/>
-          <w:b w:val="false"/>
-          <w:bCs w:val="false"/>
-          <w:i w:val="false"/>
-          <w:iCs w:val="false"/>
-          <w:color w:val="2B2B33"/>
-          <w:sz w:val="24"/>
-          <w:szCs w:val="24"/>
-        </w:rPr>
-        <w:t xml:space="preserve"> (</w:t>
-      </w:r>
-      <w:r>
-        <w:rPr>
-          <w:rFonts w:ascii="Cambria" w:cs="Cambria" w:eastAsia="Cambria" w:hAnsi="Cambria"/>
-          <w:b/>
-          <w:bCs/>
-          <w:i w:val="false"/>
-          <w:iCs w:val="false"/>
-          <w:color w:val="2B2B33"/>
-          <w:sz w:val="24"/>
-          <w:szCs w:val="24"/>
-        </w:rPr>
-        <w:t xml:space="preserve">2Co 8.9</w:t>
-      </w:r>
-      <w:r>
-        <w:rPr>
-          <w:rFonts w:ascii="Cambria" w:cs="Cambria" w:eastAsia="Cambria" w:hAnsi="Cambria"/>
-          <w:b w:val="false"/>
-          <w:bCs w:val="false"/>
-          <w:i w:val="false"/>
-          <w:iCs w:val="false"/>
-          <w:color w:val="2B2B33"/>
-          <w:sz w:val="24"/>
-          <w:szCs w:val="24"/>
-        </w:rPr>
-        <w:t xml:space="preserve">; </w:t>
-      </w:r>
-      <w:r>
-        <w:rPr>
-          <w:rFonts w:ascii="Cambria" w:cs="Cambria" w:eastAsia="Cambria" w:hAnsi="Cambria"/>
-          <w:b/>
-          <w:bCs/>
-          <w:i w:val="false"/>
-          <w:iCs w:val="false"/>
-          <w:color w:val="2B2B33"/>
-          <w:sz w:val="24"/>
-          <w:szCs w:val="24"/>
-        </w:rPr>
-        <w:t xml:space="preserve">Rm 8.17</w:t>
-      </w:r>
-      <w:r>
-        <w:rPr>
-          <w:rFonts w:ascii="Cambria" w:cs="Cambria" w:eastAsia="Cambria" w:hAnsi="Cambria"/>
-          <w:b w:val="false"/>
-          <w:bCs w:val="false"/>
-          <w:i w:val="false"/>
-          <w:iCs w:val="false"/>
-          <w:color w:val="2B2B33"/>
-          <w:sz w:val="24"/>
-          <w:szCs w:val="24"/>
-        </w:rPr>
-        <w:t xml:space="preserve">)</w:t>
+        <w:t xml:space="preserve">A veste</w:t>
+      </w:r>
+      <w:r>
+        <w:rPr>
+          <w:rFonts w:ascii="Cambria" w:cs="Cambria" w:eastAsia="Cambria" w:hAnsi="Cambria"/>
+          <w:b w:val="false"/>
+          <w:bCs w:val="false"/>
+          <w:i w:val="false"/>
+          <w:iCs w:val="false"/>
+          <w:color w:val="2B2B33"/>
+          <w:sz w:val="24"/>
+          <w:szCs w:val="24"/>
+        </w:rPr>
+        <w:t xml:space="preserve">: Gl 3.27; 2Co 5.21. </w:t>
+      </w:r>
+      <w:r>
+        <w:rPr>
+          <w:rFonts w:ascii="Cambria" w:cs="Cambria" w:eastAsia="Cambria" w:hAnsi="Cambria"/>
+          <w:b w:val="false"/>
+          <w:bCs w:val="false"/>
+          <w:i/>
+          <w:iCs/>
+          <w:color w:val="2B2B33"/>
+          <w:sz w:val="24"/>
+          <w:szCs w:val="24"/>
+        </w:rPr>
+        <w:t xml:space="preserve">O pródigo, com a roupa do Pai; nós, com a justiça do Filho</w:t>
+      </w:r>
+    </w:p>
+    <w:p>
+      <w:pPr>
+        <w:spacing w:after="60"/>
+      </w:pPr>
+    </w:p>
+    <w:p>
+      <w:pPr>
+        <w:keepNext/>
+        <w:pBdr>
+          <w:bottom w:val="single" w:color="C8955B" w:sz="12" w:space="6"/>
+        </w:pBdr>
+        <w:spacing w:after="0" w:before="0" w:line="252" w:lineRule="auto"/>
+        <w:jc w:val="left"/>
+      </w:pPr>
+    </w:p>
+    <w:p>
+      <w:pPr>
+        <w:keepNext/>
+        <w:spacing w:after="160" w:before="120" w:line="280" w:lineRule="auto"/>
+        <w:jc w:val="left"/>
+      </w:pPr>
+      <w:r>
+        <w:rPr>
+          <w:rFonts w:ascii="Constantia" w:cs="Constantia" w:eastAsia="Constantia" w:hAnsi="Constantia"/>
+          <w:b/>
+          <w:bCs/>
+          <w:i w:val="false"/>
+          <w:iCs w:val="false"/>
+          <w:color w:val="252544"/>
+          <w:sz w:val="28"/>
+          <w:szCs w:val="28"/>
+        </w:rPr>
+        <w:t xml:space="preserve">Aplicação: como se entra na festa</w:t>
       </w:r>
     </w:p>
     <w:p>
@@ -4755,68 +4933,46 @@
           <w:sz w:val="24"/>
           <w:szCs w:val="24"/>
         </w:rPr>
-        <w:t xml:space="preserve">A veste</w:t>
-      </w:r>
-      <w:r>
-        <w:rPr>
-          <w:rFonts w:ascii="Cambria" w:cs="Cambria" w:eastAsia="Cambria" w:hAnsi="Cambria"/>
-          <w:b w:val="false"/>
-          <w:bCs w:val="false"/>
-          <w:i w:val="false"/>
-          <w:iCs w:val="false"/>
-          <w:color w:val="2B2B33"/>
-          <w:sz w:val="24"/>
-          <w:szCs w:val="24"/>
-        </w:rPr>
-        <w:t xml:space="preserve">: Gl 3.27; 2Co 5.21. </w:t>
-      </w:r>
-      <w:r>
-        <w:rPr>
-          <w:rFonts w:ascii="Cambria" w:cs="Cambria" w:eastAsia="Cambria" w:hAnsi="Cambria"/>
-          <w:b w:val="false"/>
-          <w:bCs w:val="false"/>
-          <w:i/>
-          <w:iCs/>
-          <w:color w:val="2B2B33"/>
-          <w:sz w:val="24"/>
-          <w:szCs w:val="24"/>
-        </w:rPr>
-        <w:t xml:space="preserve">O pródigo, com a roupa do Pai; nós, com a justiça do Filho</w:t>
-      </w:r>
-    </w:p>
-    <w:p>
-      <w:pPr>
-        <w:spacing w:after="60"/>
-      </w:pPr>
-    </w:p>
-    <w:p>
-      <w:pPr>
-        <w:keepNext/>
-        <w:pBdr>
-          <w:bottom w:val="single" w:color="C8955B" w:sz="12" w:space="6"/>
-        </w:pBdr>
-        <w:spacing w:after="0" w:before="0" w:line="252" w:lineRule="auto"/>
-        <w:jc w:val="left"/>
-      </w:pPr>
-    </w:p>
-    <w:p>
-      <w:pPr>
-        <w:keepNext/>
-        <w:spacing w:after="160" w:before="120" w:line="280" w:lineRule="auto"/>
-        <w:jc w:val="left"/>
-      </w:pPr>
-      <w:r>
-        <w:rPr>
-          <w:rFonts w:ascii="Constantia" w:cs="Constantia" w:eastAsia="Constantia" w:hAnsi="Constantia"/>
-          <w:b/>
-          <w:bCs/>
-          <w:i w:val="false"/>
-          <w:iCs w:val="false"/>
-          <w:color w:val="252544"/>
-          <w:sz w:val="28"/>
-          <w:szCs w:val="28"/>
-        </w:rPr>
-        <w:t xml:space="preserve">Aplicação: como se entra na festa</w:t>
+        <w:t xml:space="preserve">Ferguson</w:t>
+      </w:r>
+      <w:r>
+        <w:rPr>
+          <w:rFonts w:ascii="Cambria" w:cs="Cambria" w:eastAsia="Cambria" w:hAnsi="Cambria"/>
+          <w:b w:val="false"/>
+          <w:bCs w:val="false"/>
+          <w:i w:val="false"/>
+          <w:iCs w:val="false"/>
+          <w:color w:val="2B2B33"/>
+          <w:sz w:val="24"/>
+          <w:szCs w:val="24"/>
+        </w:rPr>
+        <w:t xml:space="preserve">: legalismo e antinomismo, "</w:t>
+      </w:r>
+      <w:r>
+        <w:rPr>
+          <w:rFonts w:ascii="Cambria" w:cs="Cambria" w:eastAsia="Cambria" w:hAnsi="Cambria"/>
+          <w:b/>
+          <w:bCs/>
+          <w:i w:val="false"/>
+          <w:iCs w:val="false"/>
+          <w:color w:val="2B2B33"/>
+          <w:sz w:val="24"/>
+          <w:szCs w:val="24"/>
+        </w:rPr>
+        <w:t xml:space="preserve">gêmeos não idênticos do mesmo ventre</w:t>
+      </w:r>
+      <w:r>
+        <w:rPr>
+          <w:rFonts w:ascii="Cambria" w:cs="Cambria" w:eastAsia="Cambria" w:hAnsi="Cambria"/>
+          <w:b w:val="false"/>
+          <w:bCs w:val="false"/>
+          <w:i w:val="false"/>
+          <w:iCs w:val="false"/>
+          <w:color w:val="2B2B33"/>
+          <w:sz w:val="24"/>
+          <w:szCs w:val="24"/>
+        </w:rPr>
+        <w:t xml:space="preserve">", nascidos da mentira de que Deus não é bom. Não se cura um com dose do outro; a cura é Cristo, de graça</w:t>
       </w:r>
     </w:p>
     <w:p>
@@ -4840,46 +4996,150 @@
           <w:sz w:val="24"/>
           <w:szCs w:val="24"/>
         </w:rPr>
-        <w:t xml:space="preserve">Ferguson</w:t>
-      </w:r>
-      <w:r>
-        <w:rPr>
-          <w:rFonts w:ascii="Cambria" w:cs="Cambria" w:eastAsia="Cambria" w:hAnsi="Cambria"/>
-          <w:b w:val="false"/>
-          <w:bCs w:val="false"/>
-          <w:i w:val="false"/>
-          <w:iCs w:val="false"/>
-          <w:color w:val="2B2B33"/>
-          <w:sz w:val="24"/>
-          <w:szCs w:val="24"/>
-        </w:rPr>
-        <w:t xml:space="preserve">: legalismo e antinomismo, "</w:t>
-      </w:r>
-      <w:r>
-        <w:rPr>
-          <w:rFonts w:ascii="Cambria" w:cs="Cambria" w:eastAsia="Cambria" w:hAnsi="Cambria"/>
-          <w:b/>
-          <w:bCs/>
-          <w:i w:val="false"/>
-          <w:iCs w:val="false"/>
-          <w:color w:val="2B2B33"/>
-          <w:sz w:val="24"/>
-          <w:szCs w:val="24"/>
-        </w:rPr>
-        <w:t xml:space="preserve">gêmeos não idênticos do mesmo ventre</w:t>
-      </w:r>
-      <w:r>
-        <w:rPr>
-          <w:rFonts w:ascii="Cambria" w:cs="Cambria" w:eastAsia="Cambria" w:hAnsi="Cambria"/>
-          <w:b w:val="false"/>
-          <w:bCs w:val="false"/>
-          <w:i w:val="false"/>
-          <w:iCs w:val="false"/>
-          <w:color w:val="2B2B33"/>
-          <w:sz w:val="24"/>
-          <w:szCs w:val="24"/>
-        </w:rPr>
-        <w:t xml:space="preserve">", nascidos da mentira de que Deus não é bom. Não se cura um com dose do outro; a cura é Cristo, de graça</w:t>
+        <w:t xml:space="preserve">1. Longe de casa, "Levanta-te e volta"</w:t>
+      </w:r>
+      <w:r>
+        <w:rPr>
+          <w:rFonts w:ascii="Cambria" w:cs="Cambria" w:eastAsia="Cambria" w:hAnsi="Cambria"/>
+          <w:b w:val="false"/>
+          <w:bCs w:val="false"/>
+          <w:i w:val="false"/>
+          <w:iCs w:val="false"/>
+          <w:color w:val="2B2B33"/>
+          <w:sz w:val="24"/>
+          <w:szCs w:val="24"/>
+        </w:rPr>
+        <w:t xml:space="preserve">. </w:t>
+      </w:r>
+      <w:r>
+        <w:rPr>
+          <w:rFonts w:ascii="Cambria" w:cs="Cambria" w:eastAsia="Cambria" w:hAnsi="Cambria"/>
+          <w:b w:val="false"/>
+          <w:bCs w:val="false"/>
+          <w:i/>
+          <w:iCs/>
+          <w:color w:val="2B2B33"/>
+          <w:sz w:val="24"/>
+          <w:szCs w:val="24"/>
+        </w:rPr>
+        <w:t xml:space="preserve">Como não</w:t>
+      </w:r>
+      <w:r>
+        <w:rPr>
+          <w:rFonts w:ascii="Cambria" w:cs="Cambria" w:eastAsia="Cambria" w:hAnsi="Cambria"/>
+          <w:b w:val="false"/>
+          <w:bCs w:val="false"/>
+          <w:i w:val="false"/>
+          <w:iCs w:val="false"/>
+          <w:color w:val="2B2B33"/>
+          <w:sz w:val="24"/>
+          <w:szCs w:val="24"/>
+        </w:rPr>
+        <w:t xml:space="preserve">: plano de pagamento, esperar ficar digno. </w:t>
+      </w:r>
+      <w:r>
+        <w:rPr>
+          <w:rFonts w:ascii="Cambria" w:cs="Cambria" w:eastAsia="Cambria" w:hAnsi="Cambria"/>
+          <w:b w:val="false"/>
+          <w:bCs w:val="false"/>
+          <w:i/>
+          <w:iCs/>
+          <w:color w:val="2B2B33"/>
+          <w:sz w:val="24"/>
+          <w:szCs w:val="24"/>
+        </w:rPr>
+        <w:t xml:space="preserve">Como</w:t>
+      </w:r>
+      <w:r>
+        <w:rPr>
+          <w:rFonts w:ascii="Cambria" w:cs="Cambria" w:eastAsia="Cambria" w:hAnsi="Cambria"/>
+          <w:b w:val="false"/>
+          <w:bCs w:val="false"/>
+          <w:i w:val="false"/>
+          <w:iCs w:val="false"/>
+          <w:color w:val="2B2B33"/>
+          <w:sz w:val="24"/>
+          <w:szCs w:val="24"/>
+        </w:rPr>
+        <w:t xml:space="preserve">: dar </w:t>
+      </w:r>
+      <w:r>
+        <w:rPr>
+          <w:rFonts w:ascii="Cambria" w:cs="Cambria" w:eastAsia="Cambria" w:hAnsi="Cambria"/>
+          <w:b/>
+          <w:bCs/>
+          <w:i w:val="false"/>
+          <w:iCs w:val="false"/>
+          <w:color w:val="2B2B33"/>
+          <w:sz w:val="24"/>
+          <w:szCs w:val="24"/>
+        </w:rPr>
+        <w:t xml:space="preserve">nome</w:t>
+      </w:r>
+      <w:r>
+        <w:rPr>
+          <w:rFonts w:ascii="Cambria" w:cs="Cambria" w:eastAsia="Cambria" w:hAnsi="Cambria"/>
+          <w:b w:val="false"/>
+          <w:bCs w:val="false"/>
+          <w:i w:val="false"/>
+          <w:iCs w:val="false"/>
+          <w:color w:val="2B2B33"/>
+          <w:sz w:val="24"/>
+          <w:szCs w:val="24"/>
+        </w:rPr>
+        <w:t xml:space="preserve"> à terra distante, confessar sem eufemismo, mãos vazias. </w:t>
+      </w:r>
+      <w:r>
+        <w:rPr>
+          <w:rFonts w:ascii="Cambria" w:cs="Cambria" w:eastAsia="Cambria" w:hAnsi="Cambria"/>
+          <w:b/>
+          <w:bCs/>
+          <w:i w:val="false"/>
+          <w:iCs w:val="false"/>
+          <w:color w:val="2B2B33"/>
+          <w:sz w:val="24"/>
+          <w:szCs w:val="24"/>
+        </w:rPr>
+        <w:t xml:space="preserve">Semana</w:t>
+      </w:r>
+      <w:r>
+        <w:rPr>
+          <w:rFonts w:ascii="Cambria" w:cs="Cambria" w:eastAsia="Cambria" w:hAnsi="Cambria"/>
+          <w:b w:val="false"/>
+          <w:bCs w:val="false"/>
+          <w:i w:val="false"/>
+          <w:iCs w:val="false"/>
+          <w:color w:val="2B2B33"/>
+          <w:sz w:val="24"/>
+          <w:szCs w:val="24"/>
+        </w:rPr>
+        <w:t xml:space="preserve">: contar ao pastor ou a um irmão; </w:t>
+      </w:r>
+      <w:r>
+        <w:rPr>
+          <w:rFonts w:ascii="Cambria" w:cs="Cambria" w:eastAsia="Cambria" w:hAnsi="Cambria"/>
+          <w:b/>
+          <w:bCs/>
+          <w:i w:val="false"/>
+          <w:iCs w:val="false"/>
+          <w:color w:val="2B2B33"/>
+          <w:sz w:val="24"/>
+          <w:szCs w:val="24"/>
+        </w:rPr>
+        <w:t xml:space="preserve">apagar o app hoje</w:t>
+      </w:r>
+      <w:r>
+        <w:rPr>
+          <w:rFonts w:ascii="Cambria" w:cs="Cambria" w:eastAsia="Cambria" w:hAnsi="Cambria"/>
+          <w:b w:val="false"/>
+          <w:bCs w:val="false"/>
+          <w:i w:val="false"/>
+          <w:iCs w:val="false"/>
+          <w:color w:val="2B2B33"/>
+          <w:sz w:val="24"/>
+          <w:szCs w:val="24"/>
+        </w:rPr>
+        <w:t xml:space="preserve">, com alguém acompanhando; voltar à mesa do Senhor</w:t>
       </w:r>
     </w:p>
     <w:p>
@@ -4903,7 +5163,7 @@
           <w:sz w:val="24"/>
           <w:szCs w:val="24"/>
         </w:rPr>
-        <w:t xml:space="preserve">1. Longe de casa, "Levanta-te e volta"</w:t>
+        <w:t xml:space="preserve">2. Dentro de casa, "Entra e alegra-te"</w:t>
       </w:r>
       <w:r>
         <w:rPr>
@@ -4942,7 +5202,33 @@
           <w:sz w:val="24"/>
           <w:szCs w:val="24"/>
         </w:rPr>
-        <w:t xml:space="preserve">: plano de pagamento, esperar ficar digno. </w:t>
+        <w:t xml:space="preserve">: fingir alegria; "menos fariseu" na força; largar a obediência (</w:t>
+      </w:r>
+      <w:r>
+        <w:rPr>
+          <w:rFonts w:ascii="Cambria" w:cs="Cambria" w:eastAsia="Cambria" w:hAnsi="Cambria"/>
+          <w:b/>
+          <w:bCs/>
+          <w:i w:val="false"/>
+          <w:iCs w:val="false"/>
+          <w:color w:val="2B2B33"/>
+          <w:sz w:val="24"/>
+          <w:szCs w:val="24"/>
+        </w:rPr>
+        <w:t xml:space="preserve">importa!</w:t>
+      </w:r>
+      <w:r>
+        <w:rPr>
+          <w:rFonts w:ascii="Cambria" w:cs="Cambria" w:eastAsia="Cambria" w:hAnsi="Cambria"/>
+          <w:b w:val="false"/>
+          <w:bCs w:val="false"/>
+          <w:i w:val="false"/>
+          <w:iCs w:val="false"/>
+          <w:color w:val="2B2B33"/>
+          <w:sz w:val="24"/>
+          <w:szCs w:val="24"/>
+        </w:rPr>
+        <w:t xml:space="preserve">). </w:t>
       </w:r>
       <w:r>
         <w:rPr>
@@ -4968,85 +5254,46 @@
           <w:sz w:val="24"/>
           <w:szCs w:val="24"/>
         </w:rPr>
-        <w:t xml:space="preserve">: dar </w:t>
-      </w:r>
-      <w:r>
-        <w:rPr>
-          <w:rFonts w:ascii="Cambria" w:cs="Cambria" w:eastAsia="Cambria" w:hAnsi="Cambria"/>
-          <w:b/>
-          <w:bCs/>
-          <w:i w:val="false"/>
-          <w:iCs w:val="false"/>
-          <w:color w:val="2B2B33"/>
-          <w:sz w:val="24"/>
-          <w:szCs w:val="24"/>
-        </w:rPr>
-        <w:t xml:space="preserve">nome</w:t>
-      </w:r>
-      <w:r>
-        <w:rPr>
-          <w:rFonts w:ascii="Cambria" w:cs="Cambria" w:eastAsia="Cambria" w:hAnsi="Cambria"/>
-          <w:b w:val="false"/>
-          <w:bCs w:val="false"/>
-          <w:i w:val="false"/>
-          <w:iCs w:val="false"/>
-          <w:color w:val="2B2B33"/>
-          <w:sz w:val="24"/>
-          <w:szCs w:val="24"/>
-        </w:rPr>
-        <w:t xml:space="preserve"> à terra distante, confessar sem eufemismo, mãos vazias. </w:t>
-      </w:r>
-      <w:r>
-        <w:rPr>
-          <w:rFonts w:ascii="Cambria" w:cs="Cambria" w:eastAsia="Cambria" w:hAnsi="Cambria"/>
-          <w:b/>
-          <w:bCs/>
-          <w:i w:val="false"/>
-          <w:iCs w:val="false"/>
-          <w:color w:val="2B2B33"/>
-          <w:sz w:val="24"/>
-          <w:szCs w:val="24"/>
-        </w:rPr>
-        <w:t xml:space="preserve">Semana</w:t>
-      </w:r>
-      <w:r>
-        <w:rPr>
-          <w:rFonts w:ascii="Cambria" w:cs="Cambria" w:eastAsia="Cambria" w:hAnsi="Cambria"/>
-          <w:b w:val="false"/>
-          <w:bCs w:val="false"/>
-          <w:i w:val="false"/>
-          <w:iCs w:val="false"/>
-          <w:color w:val="2B2B33"/>
-          <w:sz w:val="24"/>
-          <w:szCs w:val="24"/>
-        </w:rPr>
-        <w:t xml:space="preserve">: contar ao pastor ou a um irmão; </w:t>
-      </w:r>
-      <w:r>
-        <w:rPr>
-          <w:rFonts w:ascii="Cambria" w:cs="Cambria" w:eastAsia="Cambria" w:hAnsi="Cambria"/>
-          <w:b/>
-          <w:bCs/>
-          <w:i w:val="false"/>
-          <w:iCs w:val="false"/>
-          <w:color w:val="2B2B33"/>
-          <w:sz w:val="24"/>
-          <w:szCs w:val="24"/>
-        </w:rPr>
-        <w:t xml:space="preserve">apagar o app hoje</w:t>
-      </w:r>
-      <w:r>
-        <w:rPr>
-          <w:rFonts w:ascii="Cambria" w:cs="Cambria" w:eastAsia="Cambria" w:hAnsi="Cambria"/>
-          <w:b w:val="false"/>
-          <w:bCs w:val="false"/>
-          <w:i w:val="false"/>
-          <w:iCs w:val="false"/>
-          <w:color w:val="2B2B33"/>
-          <w:sz w:val="24"/>
-          <w:szCs w:val="24"/>
-        </w:rPr>
-        <w:t xml:space="preserve">, com alguém acompanhando; voltar à mesa do Senhor</w:t>
+        <w:t xml:space="preserve">: </w:t>
+      </w:r>
+      <w:r>
+        <w:rPr>
+          <w:rFonts w:ascii="Cambria" w:cs="Cambria" w:eastAsia="Cambria" w:hAnsi="Cambria"/>
+          <w:b/>
+          <w:bCs/>
+          <w:i w:val="false"/>
+          <w:iCs w:val="false"/>
+          <w:color w:val="2B2B33"/>
+          <w:sz w:val="24"/>
+          <w:szCs w:val="24"/>
+        </w:rPr>
+        <w:t xml:space="preserve">arrepender-se das razões</w:t>
+      </w:r>
+      <w:r>
+        <w:rPr>
+          <w:rFonts w:ascii="Cambria" w:cs="Cambria" w:eastAsia="Cambria" w:hAnsi="Cambria"/>
+          <w:b w:val="false"/>
+          <w:bCs w:val="false"/>
+          <w:i w:val="false"/>
+          <w:iCs w:val="false"/>
+          <w:color w:val="2B2B33"/>
+          <w:sz w:val="24"/>
+          <w:szCs w:val="24"/>
+        </w:rPr>
+        <w:t xml:space="preserve"> ("onde está o meu 'depois de tudo o que eu fiz'?"); Rm 8.32; orar </w:t>
+      </w:r>
+      <w:r>
+        <w:rPr>
+          <w:rFonts w:ascii="Cambria" w:cs="Cambria" w:eastAsia="Cambria" w:hAnsi="Cambria"/>
+          <w:b/>
+          <w:bCs/>
+          <w:i w:val="false"/>
+          <w:iCs w:val="false"/>
+          <w:color w:val="2B2B33"/>
+          <w:sz w:val="24"/>
+          <w:szCs w:val="24"/>
+        </w:rPr>
+        <w:t xml:space="preserve">sem pedir nada</w:t>
       </w:r>
     </w:p>
     <w:p>
@@ -5070,137 +5317,85 @@
           <w:sz w:val="24"/>
           <w:szCs w:val="24"/>
         </w:rPr>
-        <w:t xml:space="preserve">2. Dentro de casa, "Entra e alegra-te"</w:t>
-      </w:r>
-      <w:r>
-        <w:rPr>
-          <w:rFonts w:ascii="Cambria" w:cs="Cambria" w:eastAsia="Cambria" w:hAnsi="Cambria"/>
-          <w:b w:val="false"/>
-          <w:bCs w:val="false"/>
-          <w:i w:val="false"/>
-          <w:iCs w:val="false"/>
-          <w:color w:val="2B2B33"/>
-          <w:sz w:val="24"/>
-          <w:szCs w:val="24"/>
-        </w:rPr>
-        <w:t xml:space="preserve">. </w:t>
-      </w:r>
-      <w:r>
-        <w:rPr>
-          <w:rFonts w:ascii="Cambria" w:cs="Cambria" w:eastAsia="Cambria" w:hAnsi="Cambria"/>
-          <w:b w:val="false"/>
-          <w:bCs w:val="false"/>
-          <w:i/>
-          <w:iCs/>
-          <w:color w:val="2B2B33"/>
-          <w:sz w:val="24"/>
-          <w:szCs w:val="24"/>
-        </w:rPr>
-        <w:t xml:space="preserve">Como não</w:t>
-      </w:r>
-      <w:r>
-        <w:rPr>
-          <w:rFonts w:ascii="Cambria" w:cs="Cambria" w:eastAsia="Cambria" w:hAnsi="Cambria"/>
-          <w:b w:val="false"/>
-          <w:bCs w:val="false"/>
-          <w:i w:val="false"/>
-          <w:iCs w:val="false"/>
-          <w:color w:val="2B2B33"/>
-          <w:sz w:val="24"/>
-          <w:szCs w:val="24"/>
-        </w:rPr>
-        <w:t xml:space="preserve">: fingir alegria; "menos fariseu" na força; largar a obediência (</w:t>
-      </w:r>
-      <w:r>
-        <w:rPr>
-          <w:rFonts w:ascii="Cambria" w:cs="Cambria" w:eastAsia="Cambria" w:hAnsi="Cambria"/>
-          <w:b/>
-          <w:bCs/>
-          <w:i w:val="false"/>
-          <w:iCs w:val="false"/>
-          <w:color w:val="2B2B33"/>
-          <w:sz w:val="24"/>
-          <w:szCs w:val="24"/>
-        </w:rPr>
-        <w:t xml:space="preserve">importa!</w:t>
-      </w:r>
-      <w:r>
-        <w:rPr>
-          <w:rFonts w:ascii="Cambria" w:cs="Cambria" w:eastAsia="Cambria" w:hAnsi="Cambria"/>
-          <w:b w:val="false"/>
-          <w:bCs w:val="false"/>
-          <w:i w:val="false"/>
-          <w:iCs w:val="false"/>
-          <w:color w:val="2B2B33"/>
-          <w:sz w:val="24"/>
-          <w:szCs w:val="24"/>
-        </w:rPr>
-        <w:t xml:space="preserve">). </w:t>
-      </w:r>
-      <w:r>
-        <w:rPr>
-          <w:rFonts w:ascii="Cambria" w:cs="Cambria" w:eastAsia="Cambria" w:hAnsi="Cambria"/>
-          <w:b w:val="false"/>
-          <w:bCs w:val="false"/>
-          <w:i/>
-          <w:iCs/>
-          <w:color w:val="2B2B33"/>
-          <w:sz w:val="24"/>
-          <w:szCs w:val="24"/>
-        </w:rPr>
-        <w:t xml:space="preserve">Como</w:t>
-      </w:r>
-      <w:r>
-        <w:rPr>
-          <w:rFonts w:ascii="Cambria" w:cs="Cambria" w:eastAsia="Cambria" w:hAnsi="Cambria"/>
-          <w:b w:val="false"/>
-          <w:bCs w:val="false"/>
-          <w:i w:val="false"/>
-          <w:iCs w:val="false"/>
-          <w:color w:val="2B2B33"/>
-          <w:sz w:val="24"/>
-          <w:szCs w:val="24"/>
-        </w:rPr>
-        <w:t xml:space="preserve">: </w:t>
-      </w:r>
-      <w:r>
-        <w:rPr>
-          <w:rFonts w:ascii="Cambria" w:cs="Cambria" w:eastAsia="Cambria" w:hAnsi="Cambria"/>
-          <w:b/>
-          <w:bCs/>
-          <w:i w:val="false"/>
-          <w:iCs w:val="false"/>
-          <w:color w:val="2B2B33"/>
-          <w:sz w:val="24"/>
-          <w:szCs w:val="24"/>
-        </w:rPr>
-        <w:t xml:space="preserve">arrepender-se das razões</w:t>
-      </w:r>
-      <w:r>
-        <w:rPr>
-          <w:rFonts w:ascii="Cambria" w:cs="Cambria" w:eastAsia="Cambria" w:hAnsi="Cambria"/>
-          <w:b w:val="false"/>
-          <w:bCs w:val="false"/>
-          <w:i w:val="false"/>
-          <w:iCs w:val="false"/>
-          <w:color w:val="2B2B33"/>
-          <w:sz w:val="24"/>
-          <w:szCs w:val="24"/>
-        </w:rPr>
-        <w:t xml:space="preserve"> ("onde está o meu 'depois de tudo o que eu fiz'?"); Rm 8.32; orar </w:t>
-      </w:r>
-      <w:r>
-        <w:rPr>
-          <w:rFonts w:ascii="Cambria" w:cs="Cambria" w:eastAsia="Cambria" w:hAnsi="Cambria"/>
-          <w:b/>
-          <w:bCs/>
-          <w:i w:val="false"/>
-          <w:iCs w:val="false"/>
-          <w:color w:val="2B2B33"/>
-          <w:sz w:val="24"/>
-          <w:szCs w:val="24"/>
-        </w:rPr>
-        <w:t xml:space="preserve">sem pedir nada</w:t>
+        <w:t xml:space="preserve">TAREFA</w:t>
+      </w:r>
+      <w:r>
+        <w:rPr>
+          <w:rFonts w:ascii="Cambria" w:cs="Cambria" w:eastAsia="Cambria" w:hAnsi="Cambria"/>
+          <w:b w:val="false"/>
+          <w:bCs w:val="false"/>
+          <w:i w:val="false"/>
+          <w:iCs w:val="false"/>
+          <w:color w:val="2B2B33"/>
+          <w:sz w:val="24"/>
+          <w:szCs w:val="24"/>
+        </w:rPr>
+        <w:t xml:space="preserve"> (v. 2, "</w:t>
+      </w:r>
+      <w:r>
+        <w:rPr>
+          <w:rFonts w:ascii="Cambria" w:cs="Cambria" w:eastAsia="Cambria" w:hAnsi="Cambria"/>
+          <w:b/>
+          <w:bCs/>
+          <w:i w:val="false"/>
+          <w:iCs w:val="false"/>
+          <w:color w:val="2B2B33"/>
+          <w:sz w:val="24"/>
+          <w:szCs w:val="24"/>
+        </w:rPr>
+        <w:t xml:space="preserve">come com eles</w:t>
+      </w:r>
+      <w:r>
+        <w:rPr>
+          <w:rFonts w:ascii="Cambria" w:cs="Cambria" w:eastAsia="Cambria" w:hAnsi="Cambria"/>
+          <w:b w:val="false"/>
+          <w:bCs w:val="false"/>
+          <w:i w:val="false"/>
+          <w:iCs w:val="false"/>
+          <w:color w:val="2B2B33"/>
+          <w:sz w:val="24"/>
+          <w:szCs w:val="24"/>
+        </w:rPr>
+        <w:t xml:space="preserve">"): domingo passado, uma mensagem; </w:t>
+      </w:r>
+      <w:r>
+        <w:rPr>
+          <w:rFonts w:ascii="Cambria" w:cs="Cambria" w:eastAsia="Cambria" w:hAnsi="Cambria"/>
+          <w:b/>
+          <w:bCs/>
+          <w:i w:val="false"/>
+          <w:iCs w:val="false"/>
+          <w:color w:val="2B2B33"/>
+          <w:sz w:val="24"/>
+          <w:szCs w:val="24"/>
+        </w:rPr>
+        <w:t xml:space="preserve">hoje, a mesa</w:t>
+      </w:r>
+      <w:r>
+        <w:rPr>
+          <w:rFonts w:ascii="Cambria" w:cs="Cambria" w:eastAsia="Cambria" w:hAnsi="Cambria"/>
+          <w:b w:val="false"/>
+          <w:bCs w:val="false"/>
+          <w:i w:val="false"/>
+          <w:iCs w:val="false"/>
+          <w:color w:val="2B2B33"/>
+          <w:sz w:val="24"/>
+          <w:szCs w:val="24"/>
+        </w:rPr>
+        <w:t xml:space="preserve">. Almoço, café ou jantar com quem você trata como "filho mais novo". </w:t>
+      </w:r>
+      <w:r>
+        <w:rPr>
+          <w:rFonts w:ascii="Cambria" w:cs="Cambria" w:eastAsia="Cambria" w:hAnsi="Cambria"/>
+          <w:b/>
+          <w:bCs/>
+          <w:i w:val="false"/>
+          <w:iCs w:val="false"/>
+          <w:color w:val="2B2B33"/>
+          <w:sz w:val="24"/>
+          <w:szCs w:val="24"/>
+        </w:rPr>
+        <w:t xml:space="preserve">Não para consertar; para comer com ele</w:t>
       </w:r>
     </w:p>
     <w:p>
@@ -5224,85 +5419,176 @@
           <w:sz w:val="24"/>
           <w:szCs w:val="24"/>
         </w:rPr>
-        <w:t xml:space="preserve">TAREFA</w:t>
-      </w:r>
-      <w:r>
-        <w:rPr>
-          <w:rFonts w:ascii="Cambria" w:cs="Cambria" w:eastAsia="Cambria" w:hAnsi="Cambria"/>
-          <w:b w:val="false"/>
-          <w:bCs w:val="false"/>
-          <w:i w:val="false"/>
-          <w:iCs w:val="false"/>
-          <w:color w:val="2B2B33"/>
-          <w:sz w:val="24"/>
-          <w:szCs w:val="24"/>
-        </w:rPr>
-        <w:t xml:space="preserve"> (v. 2, "</w:t>
-      </w:r>
-      <w:r>
-        <w:rPr>
-          <w:rFonts w:ascii="Cambria" w:cs="Cambria" w:eastAsia="Cambria" w:hAnsi="Cambria"/>
-          <w:b/>
-          <w:bCs/>
-          <w:i w:val="false"/>
-          <w:iCs w:val="false"/>
-          <w:color w:val="2B2B33"/>
-          <w:sz w:val="24"/>
-          <w:szCs w:val="24"/>
-        </w:rPr>
-        <w:t xml:space="preserve">come com eles</w:t>
-      </w:r>
-      <w:r>
-        <w:rPr>
-          <w:rFonts w:ascii="Cambria" w:cs="Cambria" w:eastAsia="Cambria" w:hAnsi="Cambria"/>
-          <w:b w:val="false"/>
-          <w:bCs w:val="false"/>
-          <w:i w:val="false"/>
-          <w:iCs w:val="false"/>
-          <w:color w:val="2B2B33"/>
-          <w:sz w:val="24"/>
-          <w:szCs w:val="24"/>
-        </w:rPr>
-        <w:t xml:space="preserve">"): domingo passado, uma mensagem; </w:t>
-      </w:r>
-      <w:r>
-        <w:rPr>
-          <w:rFonts w:ascii="Cambria" w:cs="Cambria" w:eastAsia="Cambria" w:hAnsi="Cambria"/>
-          <w:b/>
-          <w:bCs/>
-          <w:i w:val="false"/>
-          <w:iCs w:val="false"/>
-          <w:color w:val="2B2B33"/>
-          <w:sz w:val="24"/>
-          <w:szCs w:val="24"/>
-        </w:rPr>
-        <w:t xml:space="preserve">hoje, a mesa</w:t>
-      </w:r>
-      <w:r>
-        <w:rPr>
-          <w:rFonts w:ascii="Cambria" w:cs="Cambria" w:eastAsia="Cambria" w:hAnsi="Cambria"/>
-          <w:b w:val="false"/>
-          <w:bCs w:val="false"/>
-          <w:i w:val="false"/>
-          <w:iCs w:val="false"/>
-          <w:color w:val="2B2B33"/>
-          <w:sz w:val="24"/>
-          <w:szCs w:val="24"/>
-        </w:rPr>
-        <w:t xml:space="preserve">. Almoço, café ou jantar com quem você trata como "filho mais novo". </w:t>
-      </w:r>
-      <w:r>
-        <w:rPr>
-          <w:rFonts w:ascii="Cambria" w:cs="Cambria" w:eastAsia="Cambria" w:hAnsi="Cambria"/>
-          <w:b/>
-          <w:bCs/>
-          <w:i w:val="false"/>
-          <w:iCs w:val="false"/>
-          <w:color w:val="2B2B33"/>
-          <w:sz w:val="24"/>
-          <w:szCs w:val="24"/>
-        </w:rPr>
-        <w:t xml:space="preserve">Não para consertar; para comer com ele</w:t>
+        <w:t xml:space="preserve">3. Igreja</w:t>
+      </w:r>
+      <w:r>
+        <w:rPr>
+          <w:rFonts w:ascii="Cambria" w:cs="Cambria" w:eastAsia="Cambria" w:hAnsi="Cambria"/>
+          <w:b w:val="false"/>
+          <w:bCs w:val="false"/>
+          <w:i w:val="false"/>
+          <w:iCs w:val="false"/>
+          <w:color w:val="2B2B33"/>
+          <w:sz w:val="24"/>
+          <w:szCs w:val="24"/>
+        </w:rPr>
+        <w:t xml:space="preserve">: "</w:t>
+      </w:r>
+      <w:r>
+        <w:rPr>
+          <w:rFonts w:ascii="Cambria" w:cs="Cambria" w:eastAsia="Cambria" w:hAnsi="Cambria"/>
+          <w:b/>
+          <w:bCs/>
+          <w:i w:val="false"/>
+          <w:iCs w:val="false"/>
+          <w:color w:val="2B2B33"/>
+          <w:sz w:val="24"/>
+          <w:szCs w:val="24"/>
+        </w:rPr>
+        <w:t xml:space="preserve">seu irmão</w:t>
+      </w:r>
+      <w:r>
+        <w:rPr>
+          <w:rFonts w:ascii="Cambria" w:cs="Cambria" w:eastAsia="Cambria" w:hAnsi="Cambria"/>
+          <w:b w:val="false"/>
+          <w:bCs w:val="false"/>
+          <w:i w:val="false"/>
+          <w:iCs w:val="false"/>
+          <w:color w:val="2B2B33"/>
+          <w:sz w:val="24"/>
+          <w:szCs w:val="24"/>
+        </w:rPr>
+        <w:t xml:space="preserve"> voltou" (v. 27; Lloyd-Jones). Irmãos mais velhos fabricam irmãos mais novos. </w:t>
+      </w:r>
+      <w:r>
+        <w:rPr>
+          <w:rFonts w:ascii="Cambria" w:cs="Cambria" w:eastAsia="Cambria" w:hAnsi="Cambria"/>
+          <w:b/>
+          <w:bCs/>
+          <w:i w:val="false"/>
+          <w:iCs w:val="false"/>
+          <w:color w:val="2B2B33"/>
+          <w:sz w:val="24"/>
+          <w:szCs w:val="24"/>
+        </w:rPr>
+        <w:t xml:space="preserve">Como</w:t>
+      </w:r>
+      <w:r>
+        <w:rPr>
+          <w:rFonts w:ascii="Cambria" w:cs="Cambria" w:eastAsia="Cambria" w:hAnsi="Cambria"/>
+          <w:b w:val="false"/>
+          <w:bCs w:val="false"/>
+          <w:i w:val="false"/>
+          <w:iCs w:val="false"/>
+          <w:color w:val="2B2B33"/>
+          <w:sz w:val="24"/>
+          <w:szCs w:val="24"/>
+        </w:rPr>
+        <w:t xml:space="preserve">: a </w:t>
+      </w:r>
+      <w:r>
+        <w:rPr>
+          <w:rFonts w:ascii="Cambria" w:cs="Cambria" w:eastAsia="Cambria" w:hAnsi="Cambria"/>
+          <w:b/>
+          <w:bCs/>
+          <w:i w:val="false"/>
+          <w:iCs w:val="false"/>
+          <w:color w:val="2B2B33"/>
+          <w:sz w:val="24"/>
+          <w:szCs w:val="24"/>
+        </w:rPr>
+        <w:t xml:space="preserve">primeira palavra</w:t>
+      </w:r>
+      <w:r>
+        <w:rPr>
+          <w:rFonts w:ascii="Cambria" w:cs="Cambria" w:eastAsia="Cambria" w:hAnsi="Cambria"/>
+          <w:b w:val="false"/>
+          <w:bCs w:val="false"/>
+          <w:i w:val="false"/>
+          <w:iCs w:val="false"/>
+          <w:color w:val="2B2B33"/>
+          <w:sz w:val="24"/>
+          <w:szCs w:val="24"/>
+        </w:rPr>
+        <w:t xml:space="preserve"> ("que bom que você voltou"); a </w:t>
+      </w:r>
+      <w:r>
+        <w:rPr>
+          <w:rFonts w:ascii="Cambria" w:cs="Cambria" w:eastAsia="Cambria" w:hAnsi="Cambria"/>
+          <w:b/>
+          <w:bCs/>
+          <w:i w:val="false"/>
+          <w:iCs w:val="false"/>
+          <w:color w:val="2B2B33"/>
+          <w:sz w:val="24"/>
+          <w:szCs w:val="24"/>
+        </w:rPr>
+        <w:t xml:space="preserve">estrada</w:t>
+      </w:r>
+      <w:r>
+        <w:rPr>
+          <w:rFonts w:ascii="Cambria" w:cs="Cambria" w:eastAsia="Cambria" w:hAnsi="Cambria"/>
+          <w:b w:val="false"/>
+          <w:bCs w:val="false"/>
+          <w:i w:val="false"/>
+          <w:iCs w:val="false"/>
+          <w:color w:val="2B2B33"/>
+          <w:sz w:val="24"/>
+          <w:szCs w:val="24"/>
+        </w:rPr>
+        <w:t xml:space="preserve"> (presbíteros e líderes de célula: um nome de quem se afastou no último ano, cada um procura um); a </w:t>
+      </w:r>
+      <w:r>
+        <w:rPr>
+          <w:rFonts w:ascii="Cambria" w:cs="Cambria" w:eastAsia="Cambria" w:hAnsi="Cambria"/>
+          <w:b/>
+          <w:bCs/>
+          <w:i w:val="false"/>
+          <w:iCs w:val="false"/>
+          <w:color w:val="2B2B33"/>
+          <w:sz w:val="24"/>
+          <w:szCs w:val="24"/>
+        </w:rPr>
+        <w:t xml:space="preserve">mesa</w:t>
+      </w:r>
+      <w:r>
+        <w:rPr>
+          <w:rFonts w:ascii="Cambria" w:cs="Cambria" w:eastAsia="Cambria" w:hAnsi="Cambria"/>
+          <w:b w:val="false"/>
+          <w:bCs w:val="false"/>
+          <w:i w:val="false"/>
+          <w:iCs w:val="false"/>
+          <w:color w:val="2B2B33"/>
+          <w:sz w:val="24"/>
+          <w:szCs w:val="24"/>
+        </w:rPr>
+        <w:t xml:space="preserve"> (quem volta não senta sozinho). </w:t>
+      </w:r>
+      <w:r>
+        <w:rPr>
+          <w:rFonts w:ascii="Cambria" w:cs="Cambria" w:eastAsia="Cambria" w:hAnsi="Cambria"/>
+          <w:b/>
+          <w:bCs/>
+          <w:i w:val="false"/>
+          <w:iCs w:val="false"/>
+          <w:color w:val="2B2B33"/>
+          <w:sz w:val="24"/>
+          <w:szCs w:val="24"/>
+        </w:rPr>
+        <w:t xml:space="preserve">Mal compreendida pelos dois lados</w:t>
+      </w:r>
+      <w:r>
+        <w:rPr>
+          <w:rFonts w:ascii="Cambria" w:cs="Cambria" w:eastAsia="Cambria" w:hAnsi="Cambria"/>
+          <w:b w:val="false"/>
+          <w:bCs w:val="false"/>
+          <w:i w:val="false"/>
+          <w:iCs w:val="false"/>
+          <w:color w:val="2B2B33"/>
+          <w:sz w:val="24"/>
+          <w:szCs w:val="24"/>
+        </w:rPr>
+        <w:t xml:space="preserve"> (Keller)</w:t>
       </w:r>
     </w:p>
     <w:p>
@@ -5318,80 +5604,128 @@
       <w:r>
         <w:rPr>
           <w:rFonts w:ascii="Cambria" w:cs="Cambria" w:eastAsia="Cambria" w:hAnsi="Cambria"/>
-          <w:b/>
-          <w:bCs/>
-          <w:i w:val="false"/>
-          <w:iCs w:val="false"/>
-          <w:color w:val="2B2B33"/>
-          <w:sz w:val="24"/>
-          <w:szCs w:val="24"/>
-        </w:rPr>
-        <w:t xml:space="preserve">3. Igreja</w:t>
-      </w:r>
-      <w:r>
-        <w:rPr>
-          <w:rFonts w:ascii="Cambria" w:cs="Cambria" w:eastAsia="Cambria" w:hAnsi="Cambria"/>
-          <w:b w:val="false"/>
-          <w:bCs w:val="false"/>
-          <w:i w:val="false"/>
-          <w:iCs w:val="false"/>
-          <w:color w:val="2B2B33"/>
-          <w:sz w:val="24"/>
-          <w:szCs w:val="24"/>
-        </w:rPr>
-        <w:t xml:space="preserve">: "</w:t>
-      </w:r>
-      <w:r>
-        <w:rPr>
-          <w:rFonts w:ascii="Cambria" w:cs="Cambria" w:eastAsia="Cambria" w:hAnsi="Cambria"/>
-          <w:b/>
-          <w:bCs/>
-          <w:i w:val="false"/>
-          <w:iCs w:val="false"/>
-          <w:color w:val="2B2B33"/>
-          <w:sz w:val="24"/>
-          <w:szCs w:val="24"/>
-        </w:rPr>
-        <w:t xml:space="preserve">seu irmão</w:t>
-      </w:r>
-      <w:r>
-        <w:rPr>
-          <w:rFonts w:ascii="Cambria" w:cs="Cambria" w:eastAsia="Cambria" w:hAnsi="Cambria"/>
-          <w:b w:val="false"/>
-          <w:bCs w:val="false"/>
-          <w:i w:val="false"/>
-          <w:iCs w:val="false"/>
-          <w:color w:val="2B2B33"/>
-          <w:sz w:val="24"/>
-          <w:szCs w:val="24"/>
-        </w:rPr>
-        <w:t xml:space="preserve"> voltou" (v. 27; Lloyd-Jones). Irmãos mais velhos fabricam irmãos mais novos. </w:t>
-      </w:r>
-      <w:r>
-        <w:rPr>
-          <w:rFonts w:ascii="Cambria" w:cs="Cambria" w:eastAsia="Cambria" w:hAnsi="Cambria"/>
-          <w:b/>
-          <w:bCs/>
-          <w:i w:val="false"/>
-          <w:iCs w:val="false"/>
-          <w:color w:val="2B2B33"/>
-          <w:sz w:val="24"/>
-          <w:szCs w:val="24"/>
-        </w:rPr>
-        <w:t xml:space="preserve">Mal compreendida pelos dois lados</w:t>
-      </w:r>
-      <w:r>
-        <w:rPr>
-          <w:rFonts w:ascii="Cambria" w:cs="Cambria" w:eastAsia="Cambria" w:hAnsi="Cambria"/>
-          <w:b w:val="false"/>
-          <w:bCs w:val="false"/>
-          <w:i w:val="false"/>
-          <w:iCs w:val="false"/>
-          <w:color w:val="2B2B33"/>
-          <w:sz w:val="24"/>
-          <w:szCs w:val="24"/>
-        </w:rPr>
-        <w:t xml:space="preserve"> (Keller)</w:t>
+          <w:b w:val="false"/>
+          <w:bCs w:val="false"/>
+          <w:i/>
+          <w:iCs/>
+          <w:color w:val="2B2B33"/>
+          <w:sz w:val="24"/>
+          <w:szCs w:val="24"/>
+        </w:rPr>
+        <w:t xml:space="preserve">Não cristão</w:t>
+      </w:r>
+      <w:r>
+        <w:rPr>
+          <w:rFonts w:ascii="Cambria" w:cs="Cambria" w:eastAsia="Cambria" w:hAnsi="Cambria"/>
+          <w:b w:val="false"/>
+          <w:bCs w:val="false"/>
+          <w:i w:val="false"/>
+          <w:iCs w:val="false"/>
+          <w:color w:val="2B2B33"/>
+          <w:sz w:val="24"/>
+          <w:szCs w:val="24"/>
+        </w:rPr>
+        <w:t xml:space="preserve">: a herança não se compra · </w:t>
+      </w:r>
+      <w:r>
+        <w:rPr>
+          <w:rFonts w:ascii="Cambria" w:cs="Cambria" w:eastAsia="Cambria" w:hAnsi="Cambria"/>
+          <w:b w:val="false"/>
+          <w:bCs w:val="false"/>
+          <w:i/>
+          <w:iCs/>
+          <w:color w:val="2B2B33"/>
+          <w:sz w:val="24"/>
+          <w:szCs w:val="24"/>
+        </w:rPr>
+        <w:t xml:space="preserve">veio de longe</w:t>
+      </w:r>
+      <w:r>
+        <w:rPr>
+          <w:rFonts w:ascii="Cambria" w:cs="Cambria" w:eastAsia="Cambria" w:hAnsi="Cambria"/>
+          <w:b w:val="false"/>
+          <w:bCs w:val="false"/>
+          <w:i w:val="false"/>
+          <w:iCs w:val="false"/>
+          <w:color w:val="2B2B33"/>
+          <w:sz w:val="24"/>
+          <w:szCs w:val="24"/>
+        </w:rPr>
+        <w:t xml:space="preserve">: não vire irmão mais velho · </w:t>
+      </w:r>
+      <w:r>
+        <w:rPr>
+          <w:rFonts w:ascii="Cambria" w:cs="Cambria" w:eastAsia="Cambria" w:hAnsi="Cambria"/>
+          <w:b w:val="false"/>
+          <w:bCs w:val="false"/>
+          <w:i/>
+          <w:iCs/>
+          <w:color w:val="2B2B33"/>
+          <w:sz w:val="24"/>
+          <w:szCs w:val="24"/>
+        </w:rPr>
+        <w:t xml:space="preserve">nasceu na igreja</w:t>
+      </w:r>
+      <w:r>
+        <w:rPr>
+          <w:rFonts w:ascii="Cambria" w:cs="Cambria" w:eastAsia="Cambria" w:hAnsi="Cambria"/>
+          <w:b w:val="false"/>
+          <w:bCs w:val="false"/>
+          <w:i w:val="false"/>
+          <w:iCs w:val="false"/>
+          <w:color w:val="2B2B33"/>
+          <w:sz w:val="24"/>
+          <w:szCs w:val="24"/>
+        </w:rPr>
+        <w:t xml:space="preserve">: "você está sempre comigo". </w:t>
+      </w:r>
+      <w:r>
+        <w:rPr>
+          <w:rFonts w:ascii="Cambria" w:cs="Cambria" w:eastAsia="Cambria" w:hAnsi="Cambria"/>
+          <w:b/>
+          <w:bCs/>
+          <w:i w:val="false"/>
+          <w:iCs w:val="false"/>
+          <w:color w:val="2B2B33"/>
+          <w:sz w:val="24"/>
+          <w:szCs w:val="24"/>
+        </w:rPr>
+        <w:t xml:space="preserve">Entra</w:t>
+      </w:r>
+    </w:p>
+    <w:p>
+      <w:pPr>
+        <w:spacing w:after="60"/>
+      </w:pPr>
+    </w:p>
+    <w:p>
+      <w:pPr>
+        <w:keepNext/>
+        <w:pBdr>
+          <w:bottom w:val="single" w:color="C8955B" w:sz="12" w:space="6"/>
+        </w:pBdr>
+        <w:spacing w:after="0" w:before="0" w:line="252" w:lineRule="auto"/>
+        <w:jc w:val="left"/>
+      </w:pPr>
+    </w:p>
+    <w:p>
+      <w:pPr>
+        <w:keepNext/>
+        <w:spacing w:after="160" w:before="120" w:line="280" w:lineRule="auto"/>
+        <w:jc w:val="left"/>
+      </w:pPr>
+      <w:r>
+        <w:rPr>
+          <w:rFonts w:ascii="Constantia" w:cs="Constantia" w:eastAsia="Constantia" w:hAnsi="Constantia"/>
+          <w:b/>
+          <w:bCs/>
+          <w:i w:val="false"/>
+          <w:iCs w:val="false"/>
+          <w:color w:val="252544"/>
+          <w:sz w:val="28"/>
+          <w:szCs w:val="28"/>
+        </w:rPr>
+        <w:t xml:space="preserve">Conclusão: a cortina fecha</w:t>
       </w:r>
     </w:p>
     <w:p>
@@ -5409,143 +5743,6 @@
           <w:rFonts w:ascii="Cambria" w:cs="Cambria" w:eastAsia="Cambria" w:hAnsi="Cambria"/>
           <w:b w:val="false"/>
           <w:bCs w:val="false"/>
-          <w:i/>
-          <w:iCs/>
-          <w:color w:val="2B2B33"/>
-          <w:sz w:val="24"/>
-          <w:szCs w:val="24"/>
-        </w:rPr>
-        <w:t xml:space="preserve">Não cristão</w:t>
-      </w:r>
-      <w:r>
-        <w:rPr>
-          <w:rFonts w:ascii="Cambria" w:cs="Cambria" w:eastAsia="Cambria" w:hAnsi="Cambria"/>
-          <w:b w:val="false"/>
-          <w:bCs w:val="false"/>
-          <w:i w:val="false"/>
-          <w:iCs w:val="false"/>
-          <w:color w:val="2B2B33"/>
-          <w:sz w:val="24"/>
-          <w:szCs w:val="24"/>
-        </w:rPr>
-        <w:t xml:space="preserve">: a herança não se compra · </w:t>
-      </w:r>
-      <w:r>
-        <w:rPr>
-          <w:rFonts w:ascii="Cambria" w:cs="Cambria" w:eastAsia="Cambria" w:hAnsi="Cambria"/>
-          <w:b w:val="false"/>
-          <w:bCs w:val="false"/>
-          <w:i/>
-          <w:iCs/>
-          <w:color w:val="2B2B33"/>
-          <w:sz w:val="24"/>
-          <w:szCs w:val="24"/>
-        </w:rPr>
-        <w:t xml:space="preserve">veio de longe</w:t>
-      </w:r>
-      <w:r>
-        <w:rPr>
-          <w:rFonts w:ascii="Cambria" w:cs="Cambria" w:eastAsia="Cambria" w:hAnsi="Cambria"/>
-          <w:b w:val="false"/>
-          <w:bCs w:val="false"/>
-          <w:i w:val="false"/>
-          <w:iCs w:val="false"/>
-          <w:color w:val="2B2B33"/>
-          <w:sz w:val="24"/>
-          <w:szCs w:val="24"/>
-        </w:rPr>
-        <w:t xml:space="preserve">: não vire irmão mais velho · </w:t>
-      </w:r>
-      <w:r>
-        <w:rPr>
-          <w:rFonts w:ascii="Cambria" w:cs="Cambria" w:eastAsia="Cambria" w:hAnsi="Cambria"/>
-          <w:b w:val="false"/>
-          <w:bCs w:val="false"/>
-          <w:i/>
-          <w:iCs/>
-          <w:color w:val="2B2B33"/>
-          <w:sz w:val="24"/>
-          <w:szCs w:val="24"/>
-        </w:rPr>
-        <w:t xml:space="preserve">nasceu na igreja</w:t>
-      </w:r>
-      <w:r>
-        <w:rPr>
-          <w:rFonts w:ascii="Cambria" w:cs="Cambria" w:eastAsia="Cambria" w:hAnsi="Cambria"/>
-          <w:b w:val="false"/>
-          <w:bCs w:val="false"/>
-          <w:i w:val="false"/>
-          <w:iCs w:val="false"/>
-          <w:color w:val="2B2B33"/>
-          <w:sz w:val="24"/>
-          <w:szCs w:val="24"/>
-        </w:rPr>
-        <w:t xml:space="preserve">: "você sempre está comigo". </w:t>
-      </w:r>
-      <w:r>
-        <w:rPr>
-          <w:rFonts w:ascii="Cambria" w:cs="Cambria" w:eastAsia="Cambria" w:hAnsi="Cambria"/>
-          <w:b/>
-          <w:bCs/>
-          <w:i w:val="false"/>
-          <w:iCs w:val="false"/>
-          <w:color w:val="2B2B33"/>
-          <w:sz w:val="24"/>
-          <w:szCs w:val="24"/>
-        </w:rPr>
-        <w:t xml:space="preserve">Entra</w:t>
-      </w:r>
-    </w:p>
-    <w:p>
-      <w:pPr>
-        <w:spacing w:after="60"/>
-      </w:pPr>
-    </w:p>
-    <w:p>
-      <w:pPr>
-        <w:keepNext/>
-        <w:pBdr>
-          <w:bottom w:val="single" w:color="C8955B" w:sz="12" w:space="6"/>
-        </w:pBdr>
-        <w:spacing w:after="0" w:before="0" w:line="252" w:lineRule="auto"/>
-        <w:jc w:val="left"/>
-      </w:pPr>
-    </w:p>
-    <w:p>
-      <w:pPr>
-        <w:keepNext/>
-        <w:spacing w:after="160" w:before="120" w:line="280" w:lineRule="auto"/>
-        <w:jc w:val="left"/>
-      </w:pPr>
-      <w:r>
-        <w:rPr>
-          <w:rFonts w:ascii="Constantia" w:cs="Constantia" w:eastAsia="Constantia" w:hAnsi="Constantia"/>
-          <w:b/>
-          <w:bCs/>
-          <w:i w:val="false"/>
-          <w:iCs w:val="false"/>
-          <w:color w:val="252544"/>
-          <w:sz w:val="28"/>
-          <w:szCs w:val="28"/>
-        </w:rPr>
-        <w:t xml:space="preserve">Conclusão: a cortina fecha</w:t>
-      </w:r>
-    </w:p>
-    <w:p>
-      <w:pPr>
-        <w:pStyle w:val="ListParagraph"/>
-        <w:numPr>
-          <w:ilvl w:val="0"/>
-          <w:numId w:val="2"/>
-        </w:numPr>
-        <w:spacing w:after="40" w:before="0" w:line="228" w:lineRule="auto"/>
-        <w:jc w:val="left"/>
-      </w:pPr>
-      <w:r>
-        <w:rPr>
-          <w:rFonts w:ascii="Cambria" w:cs="Cambria" w:eastAsia="Cambria" w:hAnsi="Cambria"/>
-          <w:b w:val="false"/>
-          <w:bCs w:val="false"/>
           <w:i w:val="false"/>
           <w:iCs w:val="false"/>
           <w:color w:val="2B2B33"/>
@@ -5604,7 +5801,7 @@
           <w:sz w:val="24"/>
           <w:szCs w:val="24"/>
         </w:rPr>
-        <w:t xml:space="preserve">. Cortina fechada (Sa'id), </w:t>
+        <w:t xml:space="preserve">. Cortina fechada (Ibrahim Sa'id, via Bailey), </w:t>
       </w:r>
       <w:r>
         <w:rPr>
@@ -5734,7 +5931,7 @@
           <w:sz w:val="24"/>
           <w:szCs w:val="24"/>
         </w:rPr>
-        <w:t xml:space="preserve">: "Ele não estava tirando nada de mim; na semana seguinte haveria picolé de novo. Ele queria que eu comesse </w:t>
+        <w:t xml:space="preserve">: "Não estava tirando nada de mim. Queria que eu comesse </w:t>
       </w:r>
       <w:r>
         <w:rPr>
@@ -5786,7 +5983,7 @@
           <w:sz w:val="24"/>
           <w:szCs w:val="24"/>
         </w:rPr>
-        <w:t xml:space="preserve"> ele. 'Esse seu irmão.'"</w:t>
+        <w:t xml:space="preserve"> ele. 'Este seu irmão.'"</w:t>
       </w:r>
     </w:p>
     <w:p>
@@ -5823,7 +6020,7 @@
           <w:sz w:val="24"/>
           <w:szCs w:val="24"/>
         </w:rPr>
-        <w:t xml:space="preserve"> Reparte a vida; corre para o de longe; sai para o da porta; </w:t>
+        <w:t xml:space="preserve"> Corre, sai, </w:t>
       </w:r>
       <w:r>
         <w:rPr>
@@ -5888,19 +6085,21 @@
           <w:sz w:val="24"/>
           <w:szCs w:val="24"/>
         </w:rPr>
-        <w:t xml:space="preserve">Que a palavra do Senhor faça morada em vocês</w:t>
-      </w:r>
-    </w:p>
-    <w:p>
-      <w:pPr>
-        <w:pStyle w:val="ListParagraph"/>
-        <w:numPr>
-          <w:ilvl w:val="0"/>
-          <w:numId w:val="2"/>
-        </w:numPr>
-        <w:spacing w:after="40" w:before="0" w:line="228" w:lineRule="auto"/>
-        <w:jc w:val="left"/>
-      </w:pPr>
+        <w:t xml:space="preserve">Que a palavra...</w:t>
+      </w:r>
+      <w:r>
+        <w:rPr>
+          <w:rFonts w:ascii="Cambria" w:cs="Cambria" w:eastAsia="Cambria" w:hAnsi="Cambria"/>
+          <w:b w:val="false"/>
+          <w:bCs w:val="false"/>
+          <w:i w:val="false"/>
+          <w:iCs w:val="false"/>
+          <w:color w:val="2B2B33"/>
+          <w:sz w:val="24"/>
+          <w:szCs w:val="24"/>
+        </w:rPr>
+        <w:t xml:space="preserve"> · </w:t>
+      </w:r>
       <w:r>
         <w:rPr>
           <w:rFonts w:ascii="Cambria" w:cs="Cambria" w:eastAsia="Cambria" w:hAnsi="Cambria"/>
@@ -5925,7 +6124,7 @@
           <w:sz w:val="24"/>
           <w:szCs w:val="24"/>
         </w:rPr>
-        <w:t xml:space="preserve">: "dá-me" e "nunca me deste"; o Pai que corre e sai; o Filho → </w:t>
+        <w:t xml:space="preserve">: "dá-me" e "nunca me deste"; o Pai que corre e sai; </w:t>
       </w:r>
       <w:r>
         <w:rPr>

</xml_diff>

<commit_message>
Lc 15.11-32: 86 notas de rodapé e bibliografia no sermão final; corrige atribuição a Lloyd-Jones e a nota sobre kolláō
Co-Authored-By: Claude Opus 5.5 <noreply@anthropic.com>
Claude-Session: https://claude.ai/code/session_01XSxGhi4Q8iZVijzMQYveMu
</commit_message>
<xml_diff>
--- a/estudos/lucas/Duas-Formas-de-Fugir-do-Rei_Lc15-11-32_pulpito.docx
+++ b/estudos/lucas/Duas-Formas-de-Fugir-do-Rei_Lc15-11-32_pulpito.docx
@@ -774,7 +774,33 @@
           <w:sz w:val="24"/>
           <w:szCs w:val="24"/>
         </w:rPr>
-        <w:t xml:space="preserve">: fome; "foi pedir trabalho" (grego: "colou-se") a um estrangeiro (</w:t>
+        <w:t xml:space="preserve">: fome; "foi pedir trabalho" (grego </w:t>
+      </w:r>
+      <w:r>
+        <w:rPr>
+          <w:rFonts w:ascii="Cambria" w:cs="Cambria" w:eastAsia="Cambria" w:hAnsi="Cambria"/>
+          <w:b w:val="false"/>
+          <w:bCs w:val="false"/>
+          <w:i/>
+          <w:iCs/>
+          <w:color w:val="2B2B33"/>
+          <w:sz w:val="24"/>
+          <w:szCs w:val="24"/>
+        </w:rPr>
+        <w:t xml:space="preserve">kolláō</w:t>
+      </w:r>
+      <w:r>
+        <w:rPr>
+          <w:rFonts w:ascii="Cambria" w:cs="Cambria" w:eastAsia="Cambria" w:hAnsi="Cambria"/>
+          <w:b w:val="false"/>
+          <w:bCs w:val="false"/>
+          <w:i w:val="false"/>
+          <w:iCs w:val="false"/>
+          <w:color w:val="2B2B33"/>
+          <w:sz w:val="24"/>
+          <w:szCs w:val="24"/>
+        </w:rPr>
+        <w:t xml:space="preserve">, raiz de "cola": agregou-se) a um estrangeiro (</w:t>
       </w:r>
       <w:r>
         <w:rPr>
@@ -1533,7 +1559,7 @@
           <w:sz w:val="24"/>
           <w:szCs w:val="24"/>
         </w:rPr>
-        <w:t xml:space="preserve">. Kistemaker: "o pai o impediu, beijando-o e tratando-o como filho". Lloyd-Jones: no abraço, o narrador se cala</w:t>
+        <w:t xml:space="preserve">. Kistemaker: "o pai o impediu, beijando-o e tratando-o como filho". No chiqueiro ouvimos o que ele pensa; no abraço, o narrador se cala</w:t>
       </w:r>
     </w:p>
     <w:p>

</xml_diff>

<commit_message>
Lc 15.11-32: ponto I com as duas formas de viver na terra distante; versículos conferidos na NAA; CT-010 e CT-011 no banco
- Troca os exemplos do ponto I (apostas, a moça, o executivo) por duas formas
  de viver na terra distante: a facilidade da vida dissoluta (o eu sem dono, a
  razão sem Deus, o reino sem Rei) e a versão gospel (fé do sentimento, culto
  antropocêntrico, prosperidade)
- Alinha a aplicação a quem está longe de casa, com passos para cada forma
- Corrige para a NAA Jo 17.10, Hb 2.11, Lc 7.34, Gl 4.6-7, Rm 8.32, Jo 10.18,
  2Co 8.9 e Gl 3.27; 101 notas; esboço de púlpito atualizado
- Registra os usos de CT-002 a CT-009 e acrescenta ao estudo a seção 4.6

Co-Authored-By: Claude Opus 5.5 <noreply@anthropic.com>
Claude-Session: https://claude.ai/code/session_01XSxGhi4Q8iZVijzMQYveMu
</commit_message>
<xml_diff>
--- a/estudos/lucas/Duas-Formas-de-Fugir-do-Rei_Lc15-11-32_pulpito.docx
+++ b/estudos/lucas/Duas-Formas-de-Fugir-do-Rei_Lc15-11-32_pulpito.docx
@@ -913,72 +913,884 @@
           <w:sz w:val="24"/>
           <w:szCs w:val="24"/>
         </w:rPr>
-        <w:t xml:space="preserve">Hoje</w:t>
-      </w:r>
-      <w:r>
-        <w:rPr>
-          <w:rFonts w:ascii="Cambria" w:cs="Cambria" w:eastAsia="Cambria" w:hAnsi="Cambria"/>
-          <w:b w:val="false"/>
-          <w:bCs w:val="false"/>
-          <w:i w:val="false"/>
-          <w:iCs w:val="false"/>
-          <w:color w:val="2B2B33"/>
-          <w:sz w:val="24"/>
-          <w:szCs w:val="24"/>
-        </w:rPr>
-        <w:t xml:space="preserve">: "minha vida, minhas regras"; a </w:t>
-      </w:r>
-      <w:r>
-        <w:rPr>
-          <w:rFonts w:ascii="Cambria" w:cs="Cambria" w:eastAsia="Cambria" w:hAnsi="Cambria"/>
-          <w:b/>
-          <w:bCs/>
-          <w:i w:val="false"/>
-          <w:iCs w:val="false"/>
-          <w:color w:val="2B2B33"/>
-          <w:sz w:val="24"/>
-          <w:szCs w:val="24"/>
-        </w:rPr>
-        <w:t xml:space="preserve">bet</w:t>
-      </w:r>
-      <w:r>
-        <w:rPr>
-          <w:rFonts w:ascii="Cambria" w:cs="Cambria" w:eastAsia="Cambria" w:hAnsi="Cambria"/>
-          <w:b w:val="false"/>
-          <w:bCs w:val="false"/>
-          <w:i w:val="false"/>
-          <w:iCs w:val="false"/>
-          <w:color w:val="2B2B33"/>
-          <w:sz w:val="24"/>
-          <w:szCs w:val="24"/>
-        </w:rPr>
-        <w:t xml:space="preserve"> de madrugada; a moça cansada do "não"; o executivo querido pelo que dá. </w:t>
-      </w:r>
-      <w:r>
-        <w:rPr>
-          <w:rFonts w:ascii="Cambria" w:cs="Cambria" w:eastAsia="Cambria" w:hAnsi="Cambria"/>
-          <w:b/>
-          <w:bCs/>
-          <w:i w:val="false"/>
-          <w:iCs w:val="false"/>
-          <w:color w:val="2B2B33"/>
-          <w:sz w:val="24"/>
-          <w:szCs w:val="24"/>
-        </w:rPr>
-        <w:t xml:space="preserve">Na igreja</w:t>
-      </w:r>
-      <w:r>
-        <w:rPr>
-          <w:rFonts w:ascii="Cambria" w:cs="Cambria" w:eastAsia="Cambria" w:hAnsi="Cambria"/>
-          <w:b w:val="false"/>
-          <w:bCs w:val="false"/>
-          <w:i w:val="false"/>
-          <w:iCs w:val="false"/>
-          <w:color w:val="2B2B33"/>
-          <w:sz w:val="24"/>
-          <w:szCs w:val="24"/>
-        </w:rPr>
-        <w:t xml:space="preserve">: prosperidade, Deus como caixa eletrônico, "o v. 12 com música gospel". </w:t>
+        <w:t xml:space="preserve">Hoje, duas formas de viver na terra distante</w:t>
+      </w:r>
+    </w:p>
+    <w:p>
+      <w:pPr>
+        <w:pStyle w:val="ListParagraph"/>
+        <w:numPr>
+          <w:ilvl w:val="1"/>
+          <w:numId w:val="2"/>
+        </w:numPr>
+        <w:spacing w:after="40" w:before="0" w:line="228" w:lineRule="auto"/>
+        <w:jc w:val="left"/>
+      </w:pPr>
+      <w:r>
+        <w:rPr>
+          <w:rFonts w:ascii="Cambria" w:cs="Cambria" w:eastAsia="Cambria" w:hAnsi="Cambria"/>
+          <w:b/>
+          <w:bCs/>
+          <w:i w:val="false"/>
+          <w:iCs w:val="false"/>
+          <w:color w:val="2B2B33"/>
+          <w:sz w:val="24"/>
+          <w:szCs w:val="24"/>
+        </w:rPr>
+        <w:t xml:space="preserve">1ª: a facilidade da vida dissoluta.</w:t>
+      </w:r>
+      <w:r>
+        <w:rPr>
+          <w:rFonts w:ascii="Cambria" w:cs="Cambria" w:eastAsia="Cambria" w:hAnsi="Cambria"/>
+          <w:b w:val="false"/>
+          <w:bCs w:val="false"/>
+          <w:i w:val="false"/>
+          <w:iCs w:val="false"/>
+          <w:color w:val="2B2B33"/>
+          <w:sz w:val="24"/>
+          <w:szCs w:val="24"/>
+        </w:rPr>
+        <w:t xml:space="preserve"> "</w:t>
+      </w:r>
+      <w:r>
+        <w:rPr>
+          <w:rFonts w:ascii="Cambria" w:cs="Cambria" w:eastAsia="Cambria" w:hAnsi="Cambria"/>
+          <w:b/>
+          <w:bCs/>
+          <w:i w:val="false"/>
+          <w:iCs w:val="false"/>
+          <w:color w:val="2B2B33"/>
+          <w:sz w:val="24"/>
+          <w:szCs w:val="24"/>
+        </w:rPr>
+        <w:t xml:space="preserve">Não muitos dias</w:t>
+      </w:r>
+      <w:r>
+        <w:rPr>
+          <w:rFonts w:ascii="Cambria" w:cs="Cambria" w:eastAsia="Cambria" w:hAnsi="Cambria"/>
+          <w:b w:val="false"/>
+          <w:bCs w:val="false"/>
+          <w:i w:val="false"/>
+          <w:iCs w:val="false"/>
+          <w:color w:val="2B2B33"/>
+          <w:sz w:val="24"/>
+          <w:szCs w:val="24"/>
+        </w:rPr>
+        <w:t xml:space="preserve">" (v. 13): a correnteza corre para lá. A terra distante é </w:t>
+      </w:r>
+      <w:r>
+        <w:rPr>
+          <w:rFonts w:ascii="Cambria" w:cs="Cambria" w:eastAsia="Cambria" w:hAnsi="Cambria"/>
+          <w:b/>
+          <w:bCs/>
+          <w:i w:val="false"/>
+          <w:iCs w:val="false"/>
+          <w:color w:val="2B2B33"/>
+          <w:sz w:val="24"/>
+          <w:szCs w:val="24"/>
+        </w:rPr>
+        <w:t xml:space="preserve">encantada</w:t>
+      </w:r>
+      <w:r>
+        <w:rPr>
+          <w:rFonts w:ascii="Cambria" w:cs="Cambria" w:eastAsia="Cambria" w:hAnsi="Cambria"/>
+          <w:b w:val="false"/>
+          <w:bCs w:val="false"/>
+          <w:i w:val="false"/>
+          <w:iCs w:val="false"/>
+          <w:color w:val="2B2B33"/>
+          <w:sz w:val="24"/>
+          <w:szCs w:val="24"/>
+        </w:rPr>
+        <w:t xml:space="preserve">:</w:t>
+      </w:r>
+    </w:p>
+    <w:p>
+      <w:pPr>
+        <w:pStyle w:val="ListParagraph"/>
+        <w:numPr>
+          <w:ilvl w:val="2"/>
+          <w:numId w:val="3"/>
+        </w:numPr>
+        <w:spacing w:after="40" w:before="0" w:line="228" w:lineRule="auto"/>
+        <w:jc w:val="left"/>
+      </w:pPr>
+      <w:r>
+        <w:rPr>
+          <w:rFonts w:ascii="Cambria" w:cs="Cambria" w:eastAsia="Cambria" w:hAnsi="Cambria"/>
+          <w:b/>
+          <w:bCs/>
+          <w:i w:val="false"/>
+          <w:iCs w:val="false"/>
+          <w:color w:val="2B2B33"/>
+          <w:sz w:val="24"/>
+          <w:szCs w:val="24"/>
+        </w:rPr>
+        <w:t xml:space="preserve">O eu sem dono</w:t>
+      </w:r>
+      <w:r>
+        <w:rPr>
+          <w:rFonts w:ascii="Cambria" w:cs="Cambria" w:eastAsia="Cambria" w:hAnsi="Cambria"/>
+          <w:b w:val="false"/>
+          <w:bCs w:val="false"/>
+          <w:i w:val="false"/>
+          <w:iCs w:val="false"/>
+          <w:color w:val="2B2B33"/>
+          <w:sz w:val="24"/>
+          <w:szCs w:val="24"/>
+        </w:rPr>
+        <w:t xml:space="preserve">: "meu corpo, minhas regras" = Gn 3.5 = </w:t>
+      </w:r>
+      <w:r>
+        <w:rPr>
+          <w:rFonts w:ascii="Cambria" w:cs="Cambria" w:eastAsia="Cambria" w:hAnsi="Cambria"/>
+          <w:b/>
+          <w:bCs/>
+          <w:i w:val="false"/>
+          <w:iCs w:val="false"/>
+          <w:color w:val="2B2B33"/>
+          <w:sz w:val="24"/>
+          <w:szCs w:val="24"/>
+        </w:rPr>
+        <w:t xml:space="preserve">o "dá-me" como visão de mundo</w:t>
+      </w:r>
+      <w:r>
+        <w:rPr>
+          <w:rFonts w:ascii="Cambria" w:cs="Cambria" w:eastAsia="Cambria" w:hAnsi="Cambria"/>
+          <w:b w:val="false"/>
+          <w:bCs w:val="false"/>
+          <w:i w:val="false"/>
+          <w:iCs w:val="false"/>
+          <w:color w:val="2B2B33"/>
+          <w:sz w:val="24"/>
+          <w:szCs w:val="24"/>
+        </w:rPr>
+        <w:t xml:space="preserve">. "Tudo" (v. 13) → "necessidade" (v. 14) → agarrado a um estranho (v. 15). Sem dono = muitos donos. </w:t>
+      </w:r>
+      <w:r>
+        <w:rPr>
+          <w:rFonts w:ascii="Cambria" w:cs="Cambria" w:eastAsia="Cambria" w:hAnsi="Cambria"/>
+          <w:b/>
+          <w:bCs/>
+          <w:i w:val="false"/>
+          <w:iCs w:val="false"/>
+          <w:color w:val="2B2B33"/>
+          <w:sz w:val="24"/>
+          <w:szCs w:val="24"/>
+        </w:rPr>
+        <w:t xml:space="preserve">"Foi ele quem nos fez, e dele somos" (Sl 100.3)</w:t>
+      </w:r>
+    </w:p>
+    <w:p>
+      <w:pPr>
+        <w:pStyle w:val="ListParagraph"/>
+        <w:numPr>
+          <w:ilvl w:val="2"/>
+          <w:numId w:val="3"/>
+        </w:numPr>
+        <w:spacing w:after="40" w:before="0" w:line="228" w:lineRule="auto"/>
+        <w:jc w:val="left"/>
+      </w:pPr>
+      <w:r>
+        <w:rPr>
+          <w:rFonts w:ascii="Cambria" w:cs="Cambria" w:eastAsia="Cambria" w:hAnsi="Cambria"/>
+          <w:b/>
+          <w:bCs/>
+          <w:i w:val="false"/>
+          <w:iCs w:val="false"/>
+          <w:color w:val="2B2B33"/>
+          <w:sz w:val="24"/>
+          <w:szCs w:val="24"/>
+        </w:rPr>
+        <w:t xml:space="preserve">A razão sem Deus</w:t>
+      </w:r>
+      <w:r>
+        <w:rPr>
+          <w:rFonts w:ascii="Cambria" w:cs="Cambria" w:eastAsia="Cambria" w:hAnsi="Cambria"/>
+          <w:b w:val="false"/>
+          <w:bCs w:val="false"/>
+          <w:i w:val="false"/>
+          <w:iCs w:val="false"/>
+          <w:color w:val="2B2B33"/>
+          <w:sz w:val="24"/>
+          <w:szCs w:val="24"/>
+        </w:rPr>
+        <w:t xml:space="preserve">: a </w:t>
+      </w:r>
+      <w:r>
+        <w:rPr>
+          <w:rFonts w:ascii="Cambria" w:cs="Cambria" w:eastAsia="Cambria" w:hAnsi="Cambria"/>
+          <w:b/>
+          <w:bCs/>
+          <w:i w:val="false"/>
+          <w:iCs w:val="false"/>
+          <w:color w:val="2B2B33"/>
+          <w:sz w:val="24"/>
+          <w:szCs w:val="24"/>
+        </w:rPr>
+        <w:t xml:space="preserve">tribo universitária</w:t>
+      </w:r>
+      <w:r>
+        <w:rPr>
+          <w:rFonts w:ascii="Cambria" w:cs="Cambria" w:eastAsia="Cambria" w:hAnsi="Cambria"/>
+          <w:b w:val="false"/>
+          <w:bCs w:val="false"/>
+          <w:i w:val="false"/>
+          <w:iCs w:val="false"/>
+          <w:color w:val="2B2B33"/>
+          <w:sz w:val="24"/>
+          <w:szCs w:val="24"/>
+        </w:rPr>
+        <w:t xml:space="preserve">; entrada = desprezar a casa do Pai. Lewis: </w:t>
+      </w:r>
+      <w:r>
+        <w:rPr>
+          <w:rFonts w:ascii="Cambria" w:cs="Cambria" w:eastAsia="Cambria" w:hAnsi="Cambria"/>
+          <w:b/>
+          <w:bCs/>
+          <w:i w:val="false"/>
+          <w:iCs w:val="false"/>
+          <w:color w:val="2B2B33"/>
+          <w:sz w:val="24"/>
+          <w:szCs w:val="24"/>
+        </w:rPr>
+        <w:t xml:space="preserve">"esnobismo cronológico"</w:t>
+      </w:r>
+      <w:r>
+        <w:rPr>
+          <w:rFonts w:ascii="Cambria" w:cs="Cambria" w:eastAsia="Cambria" w:hAnsi="Cambria"/>
+          <w:b w:val="false"/>
+          <w:bCs w:val="false"/>
+          <w:i w:val="false"/>
+          <w:iCs w:val="false"/>
+          <w:color w:val="2B2B33"/>
+          <w:sz w:val="24"/>
+          <w:szCs w:val="24"/>
+        </w:rPr>
+        <w:t xml:space="preserve">. </w:t>
+      </w:r>
+      <w:r>
+        <w:rPr>
+          <w:rFonts w:ascii="Cambria" w:cs="Cambria" w:eastAsia="Cambria" w:hAnsi="Cambria"/>
+          <w:b w:val="false"/>
+          <w:bCs w:val="false"/>
+          <w:i/>
+          <w:iCs/>
+          <w:color w:val="2B2B33"/>
+          <w:sz w:val="24"/>
+          <w:szCs w:val="24"/>
+        </w:rPr>
+        <w:t xml:space="preserve">Não é ataque ao estudo</w:t>
+      </w:r>
+      <w:r>
+        <w:rPr>
+          <w:rFonts w:ascii="Cambria" w:cs="Cambria" w:eastAsia="Cambria" w:hAnsi="Cambria"/>
+          <w:b w:val="false"/>
+          <w:bCs w:val="false"/>
+          <w:i w:val="false"/>
+          <w:iCs w:val="false"/>
+          <w:color w:val="2B2B33"/>
+          <w:sz w:val="24"/>
+          <w:szCs w:val="24"/>
+        </w:rPr>
+        <w:t xml:space="preserve"> (Mt 22.37). </w:t>
+      </w:r>
+      <w:r>
+        <w:rPr>
+          <w:rFonts w:ascii="Cambria" w:cs="Cambria" w:eastAsia="Cambria" w:hAnsi="Cambria"/>
+          <w:b/>
+          <w:bCs/>
+          <w:i w:val="false"/>
+          <w:iCs w:val="false"/>
+          <w:color w:val="2B2B33"/>
+          <w:sz w:val="24"/>
+          <w:szCs w:val="24"/>
+        </w:rPr>
+        <w:t xml:space="preserve">Pv 1.7</w:t>
+      </w:r>
+      <w:r>
+        <w:rPr>
+          <w:rFonts w:ascii="Cambria" w:cs="Cambria" w:eastAsia="Cambria" w:hAnsi="Cambria"/>
+          <w:b w:val="false"/>
+          <w:bCs w:val="false"/>
+          <w:i w:val="false"/>
+          <w:iCs w:val="false"/>
+          <w:color w:val="2B2B33"/>
+          <w:sz w:val="24"/>
+          <w:szCs w:val="24"/>
+        </w:rPr>
+        <w:t xml:space="preserve">. Lewis, 1929: </w:t>
+      </w:r>
+      <w:r>
+        <w:rPr>
+          <w:rFonts w:ascii="Cambria" w:cs="Cambria" w:eastAsia="Cambria" w:hAnsi="Cambria"/>
+          <w:b/>
+          <w:bCs/>
+          <w:i w:val="false"/>
+          <w:iCs w:val="false"/>
+          <w:color w:val="2B2B33"/>
+          <w:sz w:val="24"/>
+          <w:szCs w:val="24"/>
+        </w:rPr>
+        <w:t xml:space="preserve">"o convertido mais abatido e relutante"</w:t>
+      </w:r>
+      <w:r>
+        <w:rPr>
+          <w:rFonts w:ascii="Cambria" w:cs="Cambria" w:eastAsia="Cambria" w:hAnsi="Cambria"/>
+          <w:b w:val="false"/>
+          <w:bCs w:val="false"/>
+          <w:i w:val="false"/>
+          <w:iCs w:val="false"/>
+          <w:color w:val="2B2B33"/>
+          <w:sz w:val="24"/>
+          <w:szCs w:val="24"/>
+        </w:rPr>
+        <w:t xml:space="preserve">; "o pródigo pelo menos voltou com os próprios pés..."</w:t>
+      </w:r>
+    </w:p>
+    <w:p>
+      <w:pPr>
+        <w:pStyle w:val="ListParagraph"/>
+        <w:numPr>
+          <w:ilvl w:val="2"/>
+          <w:numId w:val="3"/>
+        </w:numPr>
+        <w:spacing w:after="40" w:before="0" w:line="228" w:lineRule="auto"/>
+        <w:jc w:val="left"/>
+      </w:pPr>
+      <w:r>
+        <w:rPr>
+          <w:rFonts w:ascii="Cambria" w:cs="Cambria" w:eastAsia="Cambria" w:hAnsi="Cambria"/>
+          <w:b/>
+          <w:bCs/>
+          <w:i w:val="false"/>
+          <w:iCs w:val="false"/>
+          <w:color w:val="2B2B33"/>
+          <w:sz w:val="24"/>
+          <w:szCs w:val="24"/>
+        </w:rPr>
+        <w:t xml:space="preserve">O reino sem Rei</w:t>
+      </w:r>
+      <w:r>
+        <w:rPr>
+          <w:rFonts w:ascii="Cambria" w:cs="Cambria" w:eastAsia="Cambria" w:hAnsi="Cambria"/>
+          <w:b w:val="false"/>
+          <w:bCs w:val="false"/>
+          <w:i w:val="false"/>
+          <w:iCs w:val="false"/>
+          <w:color w:val="2B2B33"/>
+          <w:sz w:val="24"/>
+          <w:szCs w:val="24"/>
+        </w:rPr>
+        <w:t xml:space="preserve">: partido = igreja, líder = messias, causa = salvação, adversário = demônio; </w:t>
+      </w:r>
+      <w:r>
+        <w:rPr>
+          <w:rFonts w:ascii="Cambria" w:cs="Cambria" w:eastAsia="Cambria" w:hAnsi="Cambria"/>
+          <w:b/>
+          <w:bCs/>
+          <w:i w:val="false"/>
+          <w:iCs w:val="false"/>
+          <w:color w:val="2B2B33"/>
+          <w:sz w:val="24"/>
+          <w:szCs w:val="24"/>
+        </w:rPr>
+        <w:t xml:space="preserve">só muda a bandeira</w:t>
+      </w:r>
+      <w:r>
+        <w:rPr>
+          <w:rFonts w:ascii="Cambria" w:cs="Cambria" w:eastAsia="Cambria" w:hAnsi="Cambria"/>
+          <w:b w:val="false"/>
+          <w:bCs w:val="false"/>
+          <w:i w:val="false"/>
+          <w:iCs w:val="false"/>
+          <w:color w:val="2B2B33"/>
+          <w:sz w:val="24"/>
+          <w:szCs w:val="24"/>
+        </w:rPr>
+        <w:t xml:space="preserve">. </w:t>
+      </w:r>
+      <w:r>
+        <w:rPr>
+          <w:rFonts w:ascii="Cambria" w:cs="Cambria" w:eastAsia="Cambria" w:hAnsi="Cambria"/>
+          <w:b/>
+          <w:bCs/>
+          <w:i w:val="false"/>
+          <w:iCs w:val="false"/>
+          <w:color w:val="2B2B33"/>
+          <w:sz w:val="24"/>
+          <w:szCs w:val="24"/>
+        </w:rPr>
+        <w:t xml:space="preserve">Sl 146.3</w:t>
+      </w:r>
+      <w:r>
+        <w:rPr>
+          <w:rFonts w:ascii="Cambria" w:cs="Cambria" w:eastAsia="Cambria" w:hAnsi="Cambria"/>
+          <w:b w:val="false"/>
+          <w:bCs w:val="false"/>
+          <w:i w:val="false"/>
+          <w:iCs w:val="false"/>
+          <w:color w:val="2B2B33"/>
+          <w:sz w:val="24"/>
+          <w:szCs w:val="24"/>
+        </w:rPr>
+        <w:t xml:space="preserve">. </w:t>
+      </w:r>
+      <w:r>
+        <w:rPr>
+          <w:rFonts w:ascii="Cambria" w:cs="Cambria" w:eastAsia="Cambria" w:hAnsi="Cambria"/>
+          <w:b/>
+          <w:bCs/>
+          <w:i w:val="false"/>
+          <w:iCs w:val="false"/>
+          <w:color w:val="2B2B33"/>
+          <w:sz w:val="24"/>
+          <w:szCs w:val="24"/>
+        </w:rPr>
+        <w:t xml:space="preserve">Kuyper</w:t>
+      </w:r>
+      <w:r>
+        <w:rPr>
+          <w:rFonts w:ascii="Cambria" w:cs="Cambria" w:eastAsia="Cambria" w:hAnsi="Cambria"/>
+          <w:b w:val="false"/>
+          <w:bCs w:val="false"/>
+          <w:i w:val="false"/>
+          <w:iCs w:val="false"/>
+          <w:color w:val="2B2B33"/>
+          <w:sz w:val="24"/>
+          <w:szCs w:val="24"/>
+        </w:rPr>
+        <w:t xml:space="preserve">: "...Cristo... não clame: </w:t>
+      </w:r>
+      <w:r>
+        <w:rPr>
+          <w:rFonts w:ascii="Cambria" w:cs="Cambria" w:eastAsia="Cambria" w:hAnsi="Cambria"/>
+          <w:b/>
+          <w:bCs/>
+          <w:i w:val="false"/>
+          <w:iCs w:val="false"/>
+          <w:color w:val="2B2B33"/>
+          <w:sz w:val="24"/>
+          <w:szCs w:val="24"/>
+        </w:rPr>
+        <w:t xml:space="preserve">'É meu!'</w:t>
+      </w:r>
+      <w:r>
+        <w:rPr>
+          <w:rFonts w:ascii="Cambria" w:cs="Cambria" w:eastAsia="Cambria" w:hAnsi="Cambria"/>
+          <w:b w:val="false"/>
+          <w:bCs w:val="false"/>
+          <w:i w:val="false"/>
+          <w:iCs w:val="false"/>
+          <w:color w:val="2B2B33"/>
+          <w:sz w:val="24"/>
+          <w:szCs w:val="24"/>
+        </w:rPr>
+        <w:t xml:space="preserve">"</w:t>
+      </w:r>
+    </w:p>
+    <w:p>
+      <w:pPr>
+        <w:pStyle w:val="ListParagraph"/>
+        <w:numPr>
+          <w:ilvl w:val="1"/>
+          <w:numId w:val="2"/>
+        </w:numPr>
+        <w:spacing w:after="40" w:before="0" w:line="228" w:lineRule="auto"/>
+        <w:jc w:val="left"/>
+      </w:pPr>
+      <w:r>
+        <w:rPr>
+          <w:rFonts w:ascii="Cambria" w:cs="Cambria" w:eastAsia="Cambria" w:hAnsi="Cambria"/>
+          <w:b/>
+          <w:bCs/>
+          <w:i w:val="false"/>
+          <w:iCs w:val="false"/>
+          <w:color w:val="2B2B33"/>
+          <w:sz w:val="24"/>
+          <w:szCs w:val="24"/>
+        </w:rPr>
+        <w:t xml:space="preserve">Bens do Pai sem o Pai</w:t>
+      </w:r>
+      <w:r>
+        <w:rPr>
+          <w:rFonts w:ascii="Cambria" w:cs="Cambria" w:eastAsia="Cambria" w:hAnsi="Cambria"/>
+          <w:b w:val="false"/>
+          <w:bCs w:val="false"/>
+          <w:i w:val="false"/>
+          <w:iCs w:val="false"/>
+          <w:color w:val="2B2B33"/>
+          <w:sz w:val="24"/>
+          <w:szCs w:val="24"/>
+        </w:rPr>
+        <w:t xml:space="preserve"> (Calvino: "fábrica de ídolos")</w:t>
+      </w:r>
+    </w:p>
+    <w:p>
+      <w:pPr>
+        <w:pStyle w:val="ListParagraph"/>
+        <w:numPr>
+          <w:ilvl w:val="1"/>
+          <w:numId w:val="2"/>
+        </w:numPr>
+        <w:spacing w:after="40" w:before="0" w:line="228" w:lineRule="auto"/>
+        <w:jc w:val="left"/>
+      </w:pPr>
+      <w:r>
+        <w:rPr>
+          <w:rFonts w:ascii="Cambria" w:cs="Cambria" w:eastAsia="Cambria" w:hAnsi="Cambria"/>
+          <w:b/>
+          <w:bCs/>
+          <w:i w:val="false"/>
+          <w:iCs w:val="false"/>
+          <w:color w:val="2B2B33"/>
+          <w:sz w:val="24"/>
+          <w:szCs w:val="24"/>
+        </w:rPr>
+        <w:t xml:space="preserve">2ª: a versão gospel.</w:t>
+      </w:r>
+      <w:r>
+        <w:rPr>
+          <w:rFonts w:ascii="Cambria" w:cs="Cambria" w:eastAsia="Cambria" w:hAnsi="Cambria"/>
+          <w:b w:val="false"/>
+          <w:bCs w:val="false"/>
+          <w:i w:val="false"/>
+          <w:iCs w:val="false"/>
+          <w:color w:val="2B2B33"/>
+          <w:sz w:val="24"/>
+          <w:szCs w:val="24"/>
+        </w:rPr>
+        <w:t xml:space="preserve"> </w:t>
+      </w:r>
+      <w:r>
+        <w:rPr>
+          <w:rFonts w:ascii="Cambria" w:cs="Cambria" w:eastAsia="Cambria" w:hAnsi="Cambria"/>
+          <w:b/>
+          <w:bCs/>
+          <w:i w:val="false"/>
+          <w:iCs w:val="false"/>
+          <w:color w:val="2B2B33"/>
+          <w:sz w:val="24"/>
+          <w:szCs w:val="24"/>
+        </w:rPr>
+        <w:t xml:space="preserve">Mt 15.8</w:t>
+      </w:r>
+      <w:r>
+        <w:rPr>
+          <w:rFonts w:ascii="Cambria" w:cs="Cambria" w:eastAsia="Cambria" w:hAnsi="Cambria"/>
+          <w:b w:val="false"/>
+          <w:bCs w:val="false"/>
+          <w:i w:val="false"/>
+          <w:iCs w:val="false"/>
+          <w:color w:val="2B2B33"/>
+          <w:sz w:val="24"/>
+          <w:szCs w:val="24"/>
+        </w:rPr>
+        <w:t xml:space="preserve">: longe </w:t>
+      </w:r>
+      <w:r>
+        <w:rPr>
+          <w:rFonts w:ascii="Cambria" w:cs="Cambria" w:eastAsia="Cambria" w:hAnsi="Cambria"/>
+          <w:b/>
+          <w:bCs/>
+          <w:i w:val="false"/>
+          <w:iCs w:val="false"/>
+          <w:color w:val="2B2B33"/>
+          <w:sz w:val="24"/>
+          <w:szCs w:val="24"/>
+        </w:rPr>
+        <w:t xml:space="preserve">sem sair do templo</w:t>
+      </w:r>
+    </w:p>
+    <w:p>
+      <w:pPr>
+        <w:pStyle w:val="ListParagraph"/>
+        <w:numPr>
+          <w:ilvl w:val="2"/>
+          <w:numId w:val="4"/>
+        </w:numPr>
+        <w:spacing w:after="40" w:before="0" w:line="228" w:lineRule="auto"/>
+        <w:jc w:val="left"/>
+      </w:pPr>
+      <w:r>
+        <w:rPr>
+          <w:rFonts w:ascii="Cambria" w:cs="Cambria" w:eastAsia="Cambria" w:hAnsi="Cambria"/>
+          <w:b/>
+          <w:bCs/>
+          <w:i w:val="false"/>
+          <w:iCs w:val="false"/>
+          <w:color w:val="2B2B33"/>
+          <w:sz w:val="24"/>
+          <w:szCs w:val="24"/>
+        </w:rPr>
+        <w:t xml:space="preserve">Fé do sentimento e da turma</w:t>
+      </w:r>
+      <w:r>
+        <w:rPr>
+          <w:rFonts w:ascii="Cambria" w:cs="Cambria" w:eastAsia="Cambria" w:hAnsi="Cambria"/>
+          <w:b w:val="false"/>
+          <w:bCs w:val="false"/>
+          <w:i w:val="false"/>
+          <w:iCs w:val="false"/>
+          <w:color w:val="2B2B33"/>
+          <w:sz w:val="24"/>
+          <w:szCs w:val="24"/>
+        </w:rPr>
+        <w:t xml:space="preserve">, não das Escrituras. Sentir não é o problema: </w:t>
+      </w:r>
+      <w:r>
+        <w:rPr>
+          <w:rFonts w:ascii="Cambria" w:cs="Cambria" w:eastAsia="Cambria" w:hAnsi="Cambria"/>
+          <w:b w:val="false"/>
+          <w:bCs w:val="false"/>
+          <w:i/>
+          <w:iCs/>
+          <w:color w:val="2B2B33"/>
+          <w:sz w:val="24"/>
+          <w:szCs w:val="24"/>
+        </w:rPr>
+        <w:t xml:space="preserve">bom passageiro, péssimo motorista</w:t>
+      </w:r>
+      <w:r>
+        <w:rPr>
+          <w:rFonts w:ascii="Cambria" w:cs="Cambria" w:eastAsia="Cambria" w:hAnsi="Cambria"/>
+          <w:b w:val="false"/>
+          <w:bCs w:val="false"/>
+          <w:i w:val="false"/>
+          <w:iCs w:val="false"/>
+          <w:color w:val="2B2B33"/>
+          <w:sz w:val="24"/>
+          <w:szCs w:val="24"/>
+        </w:rPr>
+        <w:t xml:space="preserve">. </w:t>
+      </w:r>
+      <w:r>
+        <w:rPr>
+          <w:rFonts w:ascii="Cambria" w:cs="Cambria" w:eastAsia="Cambria" w:hAnsi="Cambria"/>
+          <w:b/>
+          <w:bCs/>
+          <w:i w:val="false"/>
+          <w:iCs w:val="false"/>
+          <w:color w:val="2B2B33"/>
+          <w:sz w:val="24"/>
+          <w:szCs w:val="24"/>
+        </w:rPr>
+        <w:t xml:space="preserve">2Tm 4.3</w:t>
+      </w:r>
+      <w:r>
+        <w:rPr>
+          <w:rFonts w:ascii="Cambria" w:cs="Cambria" w:eastAsia="Cambria" w:hAnsi="Cambria"/>
+          <w:b w:val="false"/>
+          <w:bCs w:val="false"/>
+          <w:i w:val="false"/>
+          <w:iCs w:val="false"/>
+          <w:color w:val="2B2B33"/>
+          <w:sz w:val="24"/>
+          <w:szCs w:val="24"/>
+        </w:rPr>
+        <w:t xml:space="preserve">; o farol: </w:t>
+      </w:r>
+      <w:r>
+        <w:rPr>
+          <w:rFonts w:ascii="Cambria" w:cs="Cambria" w:eastAsia="Cambria" w:hAnsi="Cambria"/>
+          <w:b/>
+          <w:bCs/>
+          <w:i w:val="false"/>
+          <w:iCs w:val="false"/>
+          <w:color w:val="2B2B33"/>
+          <w:sz w:val="24"/>
+          <w:szCs w:val="24"/>
+        </w:rPr>
+        <w:t xml:space="preserve">Sl 119.105</w:t>
+      </w:r>
+    </w:p>
+    <w:p>
+      <w:pPr>
+        <w:pStyle w:val="ListParagraph"/>
+        <w:numPr>
+          <w:ilvl w:val="2"/>
+          <w:numId w:val="4"/>
+        </w:numPr>
+        <w:spacing w:after="40" w:before="0" w:line="228" w:lineRule="auto"/>
+        <w:jc w:val="left"/>
+      </w:pPr>
+      <w:r>
+        <w:rPr>
+          <w:rFonts w:ascii="Cambria" w:cs="Cambria" w:eastAsia="Cambria" w:hAnsi="Cambria"/>
+          <w:b/>
+          <w:bCs/>
+          <w:i w:val="false"/>
+          <w:iCs w:val="false"/>
+          <w:color w:val="2B2B33"/>
+          <w:sz w:val="24"/>
+          <w:szCs w:val="24"/>
+        </w:rPr>
+        <w:t xml:space="preserve">Culto com o homem no centro</w:t>
+      </w:r>
+      <w:r>
+        <w:rPr>
+          <w:rFonts w:ascii="Cambria" w:cs="Cambria" w:eastAsia="Cambria" w:hAnsi="Cambria"/>
+          <w:b w:val="false"/>
+          <w:bCs w:val="false"/>
+          <w:i w:val="false"/>
+          <w:iCs w:val="false"/>
+          <w:color w:val="2B2B33"/>
+          <w:sz w:val="24"/>
+          <w:szCs w:val="24"/>
+        </w:rPr>
+        <w:t xml:space="preserve">: </w:t>
+      </w:r>
+      <w:r>
+        <w:rPr>
+          <w:rFonts w:ascii="Cambria" w:cs="Cambria" w:eastAsia="Cambria" w:hAnsi="Cambria"/>
+          <w:b w:val="false"/>
+          <w:bCs w:val="false"/>
+          <w:i/>
+          <w:iCs/>
+          <w:color w:val="2B2B33"/>
+          <w:sz w:val="24"/>
+          <w:szCs w:val="24"/>
+        </w:rPr>
+        <w:t xml:space="preserve">Deus no centro, nós convidados × nós no centro, Deus convidado</w:t>
+      </w:r>
+    </w:p>
+    <w:p>
+      <w:pPr>
+        <w:pStyle w:val="ListParagraph"/>
+        <w:numPr>
+          <w:ilvl w:val="2"/>
+          <w:numId w:val="4"/>
+        </w:numPr>
+        <w:spacing w:after="40" w:before="0" w:line="228" w:lineRule="auto"/>
+        <w:jc w:val="left"/>
+      </w:pPr>
+      <w:r>
+        <w:rPr>
+          <w:rFonts w:ascii="Cambria" w:cs="Cambria" w:eastAsia="Cambria" w:hAnsi="Cambria"/>
+          <w:b/>
+          <w:bCs/>
+          <w:i w:val="false"/>
+          <w:iCs w:val="false"/>
+          <w:color w:val="2B2B33"/>
+          <w:sz w:val="24"/>
+          <w:szCs w:val="24"/>
+        </w:rPr>
+        <w:t xml:space="preserve">Prosperidade</w:t>
+      </w:r>
+      <w:r>
+        <w:rPr>
+          <w:rFonts w:ascii="Cambria" w:cs="Cambria" w:eastAsia="Cambria" w:hAnsi="Cambria"/>
+          <w:b w:val="false"/>
+          <w:bCs w:val="false"/>
+          <w:i w:val="false"/>
+          <w:iCs w:val="false"/>
+          <w:color w:val="2B2B33"/>
+          <w:sz w:val="24"/>
+          <w:szCs w:val="24"/>
+        </w:rPr>
+        <w:t xml:space="preserve">: caixa eletrônico e cartão (</w:t>
+      </w:r>
+      <w:r>
+        <w:rPr>
+          <w:rFonts w:ascii="Cambria" w:cs="Cambria" w:eastAsia="Cambria" w:hAnsi="Cambria"/>
+          <w:b/>
+          <w:bCs/>
+          <w:i w:val="false"/>
+          <w:iCs w:val="false"/>
+          <w:color w:val="2B2B33"/>
+          <w:sz w:val="24"/>
+          <w:szCs w:val="24"/>
+        </w:rPr>
+        <w:t xml:space="preserve">56%</w:t>
+      </w:r>
+      <w:r>
+        <w:rPr>
+          <w:rFonts w:ascii="Cambria" w:cs="Cambria" w:eastAsia="Cambria" w:hAnsi="Cambria"/>
+          <w:b w:val="false"/>
+          <w:bCs w:val="false"/>
+          <w:i w:val="false"/>
+          <w:iCs w:val="false"/>
+          <w:color w:val="2B2B33"/>
+          <w:sz w:val="24"/>
+          <w:szCs w:val="24"/>
+        </w:rPr>
+        <w:t xml:space="preserve">, Pew 2014); </w:t>
+      </w:r>
+      <w:r>
+        <w:rPr>
+          <w:rFonts w:ascii="Cambria" w:cs="Cambria" w:eastAsia="Cambria" w:hAnsi="Cambria"/>
+          <w:b/>
+          <w:bCs/>
+          <w:i w:val="false"/>
+          <w:iCs w:val="false"/>
+          <w:color w:val="2B2B33"/>
+          <w:sz w:val="24"/>
+          <w:szCs w:val="24"/>
+        </w:rPr>
+        <w:t xml:space="preserve">os dois filhos no mesmo altar</w:t>
+      </w:r>
+      <w:r>
+        <w:rPr>
+          <w:rFonts w:ascii="Cambria" w:cs="Cambria" w:eastAsia="Cambria" w:hAnsi="Cambria"/>
+          <w:b w:val="false"/>
+          <w:bCs w:val="false"/>
+          <w:i w:val="false"/>
+          <w:iCs w:val="false"/>
+          <w:color w:val="2B2B33"/>
+          <w:sz w:val="24"/>
+          <w:szCs w:val="24"/>
+        </w:rPr>
+        <w:t xml:space="preserve">. </w:t>
+      </w:r>
+      <w:r>
+        <w:rPr>
+          <w:rFonts w:ascii="Cambria" w:cs="Cambria" w:eastAsia="Cambria" w:hAnsi="Cambria"/>
+          <w:b/>
+          <w:bCs/>
+          <w:i w:val="false"/>
+          <w:iCs w:val="false"/>
+          <w:color w:val="2B2B33"/>
+          <w:sz w:val="24"/>
+          <w:szCs w:val="24"/>
+        </w:rPr>
+        <w:t xml:space="preserve">Quer o que Deus tem. Deus, dispensa</w:t>
+      </w:r>
+    </w:p>
+    <w:p>
+      <w:pPr>
+        <w:pStyle w:val="ListParagraph"/>
+        <w:numPr>
+          <w:ilvl w:val="1"/>
+          <w:numId w:val="2"/>
+        </w:numPr>
+        <w:spacing w:after="40" w:before="0" w:line="228" w:lineRule="auto"/>
+        <w:jc w:val="left"/>
+      </w:pPr>
+      <w:r>
+        <w:rPr>
+          <w:rFonts w:ascii="Cambria" w:cs="Cambria" w:eastAsia="Cambria" w:hAnsi="Cambria"/>
+          <w:b/>
+          <w:bCs/>
+          <w:i w:val="false"/>
+          <w:iCs w:val="false"/>
+          <w:color w:val="2B2B33"/>
+          <w:sz w:val="24"/>
+          <w:szCs w:val="24"/>
+        </w:rPr>
+        <w:t xml:space="preserve">Sem placa de denominação</w:t>
+      </w:r>
+      <w:r>
+        <w:rPr>
+          <w:rFonts w:ascii="Cambria" w:cs="Cambria" w:eastAsia="Cambria" w:hAnsi="Cambria"/>
+          <w:b w:val="false"/>
+          <w:bCs w:val="false"/>
+          <w:i w:val="false"/>
+          <w:iCs w:val="false"/>
+          <w:color w:val="2B2B33"/>
+          <w:sz w:val="24"/>
+          <w:szCs w:val="24"/>
+        </w:rPr>
+        <w:t xml:space="preserve">. </w:t>
       </w:r>
       <w:r>
         <w:rPr>
@@ -2710,7 +3522,7 @@
         <w:pStyle w:val="ListParagraph"/>
         <w:numPr>
           <w:ilvl w:val="1"/>
-          <w:numId w:val="3"/>
+          <w:numId w:val="5"/>
         </w:numPr>
         <w:spacing w:after="40" w:before="0" w:line="228" w:lineRule="auto"/>
         <w:jc w:val="left"/>
@@ -2773,7 +3585,7 @@
         <w:pStyle w:val="ListParagraph"/>
         <w:numPr>
           <w:ilvl w:val="1"/>
-          <w:numId w:val="3"/>
+          <w:numId w:val="5"/>
         </w:numPr>
         <w:spacing w:after="40" w:before="0" w:line="228" w:lineRule="auto"/>
         <w:jc w:val="left"/>
@@ -2836,7 +3648,7 @@
         <w:pStyle w:val="ListParagraph"/>
         <w:numPr>
           <w:ilvl w:val="1"/>
-          <w:numId w:val="3"/>
+          <w:numId w:val="5"/>
         </w:numPr>
         <w:spacing w:after="40" w:before="0" w:line="228" w:lineRule="auto"/>
         <w:jc w:val="left"/>
@@ -2873,7 +3685,7 @@
         <w:pStyle w:val="ListParagraph"/>
         <w:numPr>
           <w:ilvl w:val="1"/>
-          <w:numId w:val="3"/>
+          <w:numId w:val="5"/>
         </w:numPr>
         <w:spacing w:after="40" w:before="0" w:line="228" w:lineRule="auto"/>
         <w:jc w:val="left"/>
@@ -2910,7 +3722,7 @@
         <w:pStyle w:val="ListParagraph"/>
         <w:numPr>
           <w:ilvl w:val="1"/>
-          <w:numId w:val="3"/>
+          <w:numId w:val="5"/>
         </w:numPr>
         <w:spacing w:after="40" w:before="0" w:line="228" w:lineRule="auto"/>
         <w:jc w:val="left"/>
@@ -4023,7 +4835,7 @@
         <w:pStyle w:val="ListParagraph"/>
         <w:numPr>
           <w:ilvl w:val="1"/>
-          <w:numId w:val="4"/>
+          <w:numId w:val="6"/>
         </w:numPr>
         <w:spacing w:after="40" w:before="0" w:line="228" w:lineRule="auto"/>
         <w:jc w:val="left"/>
@@ -4125,7 +4937,7 @@
         <w:pStyle w:val="ListParagraph"/>
         <w:numPr>
           <w:ilvl w:val="1"/>
-          <w:numId w:val="4"/>
+          <w:numId w:val="6"/>
         </w:numPr>
         <w:spacing w:after="40" w:before="0" w:line="228" w:lineRule="auto"/>
         <w:jc w:val="left"/>
@@ -4180,7 +4992,7 @@
           <w:sz w:val="24"/>
           <w:szCs w:val="24"/>
         </w:rPr>
-        <w:t xml:space="preserve"> ("comilão... amigo de pecadores") → Dt 21.23 → </w:t>
+        <w:t xml:space="preserve"> ("glutão e bebedor de vinho, amigo de... pecadores") → Dt 21.23 → </w:t>
       </w:r>
       <w:r>
         <w:rPr>
@@ -4227,7 +5039,7 @@
         <w:pStyle w:val="ListParagraph"/>
         <w:numPr>
           <w:ilvl w:val="1"/>
-          <w:numId w:val="4"/>
+          <w:numId w:val="6"/>
         </w:numPr>
         <w:spacing w:after="40" w:before="0" w:line="228" w:lineRule="auto"/>
         <w:jc w:val="left"/>
@@ -4472,7 +5284,7 @@
         <w:pStyle w:val="ListParagraph"/>
         <w:numPr>
           <w:ilvl w:val="1"/>
-          <w:numId w:val="4"/>
+          <w:numId w:val="6"/>
         </w:numPr>
         <w:spacing w:after="40" w:before="0" w:line="228" w:lineRule="auto"/>
         <w:jc w:val="left"/>
@@ -5126,6 +5938,32 @@
           <w:sz w:val="24"/>
           <w:szCs w:val="24"/>
         </w:rPr>
+        <w:t xml:space="preserve">Nomes</w:t>
+      </w:r>
+      <w:r>
+        <w:rPr>
+          <w:rFonts w:ascii="Cambria" w:cs="Cambria" w:eastAsia="Cambria" w:hAnsi="Cambria"/>
+          <w:b w:val="false"/>
+          <w:bCs w:val="false"/>
+          <w:i w:val="false"/>
+          <w:iCs w:val="false"/>
+          <w:color w:val="2B2B33"/>
+          <w:sz w:val="24"/>
+          <w:szCs w:val="24"/>
+        </w:rPr>
+        <w:t xml:space="preserve">: "a minha vida é minha", a tribo, a ideologia, a fé do sentimento, ou o de sempre (pornografia, adultério, bebida, dinheiro). </w:t>
+      </w:r>
+      <w:r>
+        <w:rPr>
+          <w:rFonts w:ascii="Cambria" w:cs="Cambria" w:eastAsia="Cambria" w:hAnsi="Cambria"/>
+          <w:b/>
+          <w:bCs/>
+          <w:i w:val="false"/>
+          <w:iCs w:val="false"/>
+          <w:color w:val="2B2B33"/>
+          <w:sz w:val="24"/>
+          <w:szCs w:val="24"/>
+        </w:rPr>
         <w:t xml:space="preserve">Semana</w:t>
       </w:r>
       <w:r>
@@ -5152,20 +5990,202 @@
           <w:sz w:val="24"/>
           <w:szCs w:val="24"/>
         </w:rPr>
-        <w:t xml:space="preserve">apagar o app hoje</w:t>
-      </w:r>
-      <w:r>
-        <w:rPr>
-          <w:rFonts w:ascii="Cambria" w:cs="Cambria" w:eastAsia="Cambria" w:hAnsi="Cambria"/>
-          <w:b w:val="false"/>
-          <w:bCs w:val="false"/>
-          <w:i w:val="false"/>
-          <w:iCs w:val="false"/>
-          <w:color w:val="2B2B33"/>
-          <w:sz w:val="24"/>
-          <w:szCs w:val="24"/>
-        </w:rPr>
-        <w:t xml:space="preserve">, com alguém acompanhando; voltar à mesa do Senhor</w:t>
+        <w:t xml:space="preserve">tribo</w:t>
+      </w:r>
+      <w:r>
+        <w:rPr>
+          <w:rFonts w:ascii="Cambria" w:cs="Cambria" w:eastAsia="Cambria" w:hAnsi="Cambria"/>
+          <w:b w:val="false"/>
+          <w:bCs w:val="false"/>
+          <w:i w:val="false"/>
+          <w:iCs w:val="false"/>
+          <w:color w:val="2B2B33"/>
+          <w:sz w:val="24"/>
+          <w:szCs w:val="24"/>
+        </w:rPr>
+        <w:t xml:space="preserve">: trazer as perguntas (Lewis, </w:t>
+      </w:r>
+      <w:r>
+        <w:rPr>
+          <w:rFonts w:ascii="Cambria" w:cs="Cambria" w:eastAsia="Cambria" w:hAnsi="Cambria"/>
+          <w:b w:val="false"/>
+          <w:bCs w:val="false"/>
+          <w:i/>
+          <w:iCs/>
+          <w:color w:val="2B2B33"/>
+          <w:sz w:val="24"/>
+          <w:szCs w:val="24"/>
+        </w:rPr>
+        <w:t xml:space="preserve">Cristianismo Puro e Simples</w:t>
+      </w:r>
+      <w:r>
+        <w:rPr>
+          <w:rFonts w:ascii="Cambria" w:cs="Cambria" w:eastAsia="Cambria" w:hAnsi="Cambria"/>
+          <w:b w:val="false"/>
+          <w:bCs w:val="false"/>
+          <w:i w:val="false"/>
+          <w:iCs w:val="false"/>
+          <w:color w:val="2B2B33"/>
+          <w:sz w:val="24"/>
+          <w:szCs w:val="24"/>
+        </w:rPr>
+        <w:t xml:space="preserve">; Keller, </w:t>
+      </w:r>
+      <w:r>
+        <w:rPr>
+          <w:rFonts w:ascii="Cambria" w:cs="Cambria" w:eastAsia="Cambria" w:hAnsi="Cambria"/>
+          <w:b w:val="false"/>
+          <w:bCs w:val="false"/>
+          <w:i/>
+          <w:iCs/>
+          <w:color w:val="2B2B33"/>
+          <w:sz w:val="24"/>
+          <w:szCs w:val="24"/>
+        </w:rPr>
+        <w:t xml:space="preserve">A Fé na Era do Ceticismo</w:t>
+      </w:r>
+      <w:r>
+        <w:rPr>
+          <w:rFonts w:ascii="Cambria" w:cs="Cambria" w:eastAsia="Cambria" w:hAnsi="Cambria"/>
+          <w:b w:val="false"/>
+          <w:bCs w:val="false"/>
+          <w:i w:val="false"/>
+          <w:iCs w:val="false"/>
+          <w:color w:val="2B2B33"/>
+          <w:sz w:val="24"/>
+          <w:szCs w:val="24"/>
+        </w:rPr>
+        <w:t xml:space="preserve">); </w:t>
+      </w:r>
+      <w:r>
+        <w:rPr>
+          <w:rFonts w:ascii="Cambria" w:cs="Cambria" w:eastAsia="Cambria" w:hAnsi="Cambria"/>
+          <w:b/>
+          <w:bCs/>
+          <w:i w:val="false"/>
+          <w:iCs w:val="false"/>
+          <w:color w:val="2B2B33"/>
+          <w:sz w:val="24"/>
+          <w:szCs w:val="24"/>
+        </w:rPr>
+        <w:t xml:space="preserve">política</w:t>
+      </w:r>
+      <w:r>
+        <w:rPr>
+          <w:rFonts w:ascii="Cambria" w:cs="Cambria" w:eastAsia="Cambria" w:hAnsi="Cambria"/>
+          <w:b w:val="false"/>
+          <w:bCs w:val="false"/>
+          <w:i w:val="false"/>
+          <w:iCs w:val="false"/>
+          <w:color w:val="2B2B33"/>
+          <w:sz w:val="24"/>
+          <w:szCs w:val="24"/>
+        </w:rPr>
+        <w:t xml:space="preserve">: tempo de noticiário × tempo de Palavra, </w:t>
+      </w:r>
+      <w:r>
+        <w:rPr>
+          <w:rFonts w:ascii="Cambria" w:cs="Cambria" w:eastAsia="Cambria" w:hAnsi="Cambria"/>
+          <w:b/>
+          <w:bCs/>
+          <w:i w:val="false"/>
+          <w:iCs w:val="false"/>
+          <w:color w:val="2B2B33"/>
+          <w:sz w:val="24"/>
+          <w:szCs w:val="24"/>
+        </w:rPr>
+        <w:t xml:space="preserve">inverter por 7 dias</w:t>
+      </w:r>
+      <w:r>
+        <w:rPr>
+          <w:rFonts w:ascii="Cambria" w:cs="Cambria" w:eastAsia="Cambria" w:hAnsi="Cambria"/>
+          <w:b w:val="false"/>
+          <w:bCs w:val="false"/>
+          <w:i w:val="false"/>
+          <w:iCs w:val="false"/>
+          <w:color w:val="2B2B33"/>
+          <w:sz w:val="24"/>
+          <w:szCs w:val="24"/>
+        </w:rPr>
+        <w:t xml:space="preserve">; </w:t>
+      </w:r>
+      <w:r>
+        <w:rPr>
+          <w:rFonts w:ascii="Cambria" w:cs="Cambria" w:eastAsia="Cambria" w:hAnsi="Cambria"/>
+          <w:b/>
+          <w:bCs/>
+          <w:i w:val="false"/>
+          <w:iCs w:val="false"/>
+          <w:color w:val="2B2B33"/>
+          <w:sz w:val="24"/>
+          <w:szCs w:val="24"/>
+        </w:rPr>
+        <w:t xml:space="preserve">gospel</w:t>
+      </w:r>
+      <w:r>
+        <w:rPr>
+          <w:rFonts w:ascii="Cambria" w:cs="Cambria" w:eastAsia="Cambria" w:hAnsi="Cambria"/>
+          <w:b w:val="false"/>
+          <w:bCs w:val="false"/>
+          <w:i w:val="false"/>
+          <w:iCs w:val="false"/>
+          <w:color w:val="2B2B33"/>
+          <w:sz w:val="24"/>
+          <w:szCs w:val="24"/>
+        </w:rPr>
+        <w:t xml:space="preserve">: ler </w:t>
+      </w:r>
+      <w:r>
+        <w:rPr>
+          <w:rFonts w:ascii="Cambria" w:cs="Cambria" w:eastAsia="Cambria" w:hAnsi="Cambria"/>
+          <w:b/>
+          <w:bCs/>
+          <w:i w:val="false"/>
+          <w:iCs w:val="false"/>
+          <w:color w:val="2B2B33"/>
+          <w:sz w:val="24"/>
+          <w:szCs w:val="24"/>
+        </w:rPr>
+        <w:t xml:space="preserve">um Evangelho inteiro</w:t>
+      </w:r>
+      <w:r>
+        <w:rPr>
+          <w:rFonts w:ascii="Cambria" w:cs="Cambria" w:eastAsia="Cambria" w:hAnsi="Cambria"/>
+          <w:b w:val="false"/>
+          <w:bCs w:val="false"/>
+          <w:i w:val="false"/>
+          <w:iCs w:val="false"/>
+          <w:color w:val="2B2B33"/>
+          <w:sz w:val="24"/>
+          <w:szCs w:val="24"/>
+        </w:rPr>
+        <w:t xml:space="preserve"> este mês; </w:t>
+      </w:r>
+      <w:r>
+        <w:rPr>
+          <w:rFonts w:ascii="Cambria" w:cs="Cambria" w:eastAsia="Cambria" w:hAnsi="Cambria"/>
+          <w:b/>
+          <w:bCs/>
+          <w:i w:val="false"/>
+          <w:iCs w:val="false"/>
+          <w:color w:val="2B2B33"/>
+          <w:sz w:val="24"/>
+          <w:szCs w:val="24"/>
+        </w:rPr>
+        <w:t xml:space="preserve">celular</w:t>
+      </w:r>
+      <w:r>
+        <w:rPr>
+          <w:rFonts w:ascii="Cambria" w:cs="Cambria" w:eastAsia="Cambria" w:hAnsi="Cambria"/>
+          <w:b w:val="false"/>
+          <w:bCs w:val="false"/>
+          <w:i w:val="false"/>
+          <w:iCs w:val="false"/>
+          <w:color w:val="2B2B33"/>
+          <w:sz w:val="24"/>
+          <w:szCs w:val="24"/>
+        </w:rPr>
+        <w:t xml:space="preserve">: tirar hoje o que leva para lá, com alguém acompanhando; voltar à mesa do Senhor</w:t>
       </w:r>
     </w:p>
     <w:p>
@@ -10079,6 +11099,18 @@
   </w:num>
   <w:num w:numId="4">
     <w:abstractNumId w:val="4"/>
+    <w:lvlOverride w:ilvl="0">
+      <w:startOverride w:val="1"/>
+    </w:lvlOverride>
+  </w:num>
+  <w:num w:numId="5">
+    <w:abstractNumId w:val="5"/>
+    <w:lvlOverride w:ilvl="0">
+      <w:startOverride w:val="1"/>
+    </w:lvlOverride>
+  </w:num>
+  <w:num w:numId="6">
+    <w:abstractNumId w:val="6"/>
     <w:lvlOverride w:ilvl="0">
       <w:startOverride w:val="1"/>
     </w:lvlOverride>

</xml_diff>